<commit_message>
Main body word count 2696
</commit_message>
<xml_diff>
--- a/paper/26_APR_Dunlap_DataCenter_Flexibility_NE_Draft.docx
+++ b/paper/26_APR_Dunlap_DataCenter_Flexibility_NE_Draft.docx
@@ -2081,21 +2081,7 @@
           <w:rFonts w:ascii="Times New Roman" w:hAnsi="Times New Roman" w:cs="Times New Roman"/>
           <w:bCs/>
         </w:rPr>
-        <w:t xml:space="preserve">, and </w:t>
-      </w:r>
-      <w:r>
-        <w:rPr>
-          <w:rFonts w:ascii="Times New Roman" w:hAnsi="Times New Roman" w:cs="Times New Roman"/>
-          <w:bCs/>
-        </w:rPr>
-        <w:t>respectively</w:t>
-      </w:r>
-      <w:r>
-        <w:rPr>
-          <w:rFonts w:ascii="Times New Roman" w:hAnsi="Times New Roman" w:cs="Times New Roman"/>
-          <w:bCs/>
-        </w:rPr>
-        <w:t xml:space="preserve"> $41M/$399M under mixed-use scope.</w:t>
+        <w:t>, and respectively $41M/$399M under mixed-use scope.</w:t>
       </w:r>
       <w:r>
         <w:rPr>
@@ -11890,21 +11876,7 @@
           <w:rFonts w:ascii="Times New Roman" w:hAnsi="Times New Roman" w:cs="Times New Roman"/>
           <w:bCs/>
         </w:rPr>
-        <w:t>[</w:t>
-      </w:r>
-      <w:r>
-        <w:rPr>
-          <w:rFonts w:ascii="Times New Roman" w:hAnsi="Times New Roman" w:cs="Times New Roman"/>
-          <w:bCs/>
-        </w:rPr>
-        <w:t>25</w:t>
-      </w:r>
-      <w:r>
-        <w:rPr>
-          <w:rFonts w:ascii="Times New Roman" w:hAnsi="Times New Roman" w:cs="Times New Roman"/>
-          <w:bCs/>
-        </w:rPr>
-        <w:t xml:space="preserve">] </w:t>
+        <w:t xml:space="preserve">[25] </w:t>
       </w:r>
       <w:r>
         <w:rPr>
@@ -18093,6 +18065,7 @@
   <w:style w:type="character" w:default="1" w:styleId="DefaultParagraphFont">
     <w:name w:val="Default Paragraph Font"/>
     <w:uiPriority w:val="1"/>
+    <w:semiHidden/>
     <w:unhideWhenUsed/>
   </w:style>
   <w:style w:type="table" w:default="1" w:styleId="TableNormal">

</xml_diff>

<commit_message>
Content updates to 26APR NE Draft
</commit_message>
<xml_diff>
--- a/paper/26_APR_Dunlap_DataCenter_Flexibility_NE_Draft.docx
+++ b/paper/26_APR_Dunlap_DataCenter_Flexibility_NE_Draft.docx
@@ -218,7 +218,30 @@
           <w:rFonts w:ascii="Times New Roman" w:hAnsi="Times New Roman" w:cs="Times New Roman"/>
           <w:bCs/>
         </w:rPr>
-        <w:t>In PJM Interconnection, the 2027/2028 capacity auction fell 6.6 GW short of the reliability requirement</w:t>
+        <w:t xml:space="preserve">In PJM Interconnection, the 2027/2028 capacity auction fell 6.6 GW short of the reliability </w:t>
+      </w:r>
+      <w:proofErr w:type="gramStart"/>
+      <w:r>
+        <w:rPr>
+          <w:rFonts w:ascii="Times New Roman" w:hAnsi="Times New Roman" w:cs="Times New Roman"/>
+          <w:bCs/>
+        </w:rPr>
+        <w:t>requirement</w:t>
+      </w:r>
+      <w:r>
+        <w:rPr>
+          <w:rFonts w:ascii="Times New Roman" w:hAnsi="Times New Roman" w:cs="Times New Roman"/>
+          <w:bCs/>
+        </w:rPr>
+        <w:t>[</w:t>
+      </w:r>
+      <w:proofErr w:type="gramEnd"/>
+      <w:r>
+        <w:rPr>
+          <w:rFonts w:ascii="Times New Roman" w:hAnsi="Times New Roman" w:cs="Times New Roman"/>
+          <w:bCs/>
+        </w:rPr>
+        <w:t>1]</w:t>
       </w:r>
       <w:r>
         <w:rPr>
@@ -232,13 +255,6 @@
           <w:rFonts w:ascii="Times New Roman" w:hAnsi="Times New Roman" w:cs="Times New Roman"/>
           <w:bCs/>
         </w:rPr>
-        <w:t>[1]</w:t>
-      </w:r>
-      <w:r>
-        <w:rPr>
-          <w:rFonts w:ascii="Times New Roman" w:hAnsi="Times New Roman" w:cs="Times New Roman"/>
-          <w:bCs/>
-        </w:rPr>
         <w:t xml:space="preserve"> L</w:t>
       </w:r>
       <w:r>
@@ -274,14 +290,37 @@
           <w:rFonts w:ascii="Times New Roman" w:hAnsi="Times New Roman" w:cs="Times New Roman"/>
           <w:bCs/>
         </w:rPr>
-        <w:t xml:space="preserve"> total 33.7 GW by 2030 in PJM's 2026 Long-Term Load Forecast and account for effectively all net peak demand growth.</w:t>
-      </w:r>
-      <w:r>
-        <w:rPr>
-          <w:rFonts w:ascii="Times New Roman" w:hAnsi="Times New Roman" w:cs="Times New Roman"/>
-          <w:bCs/>
-        </w:rPr>
-        <w:t>[2]</w:t>
+        <w:t xml:space="preserve"> total 33.7 GW by 2030 in PJM's 2026 Long-Term Load Forecast and account for effectively all net peak demand </w:t>
+      </w:r>
+      <w:proofErr w:type="gramStart"/>
+      <w:r>
+        <w:rPr>
+          <w:rFonts w:ascii="Times New Roman" w:hAnsi="Times New Roman" w:cs="Times New Roman"/>
+          <w:bCs/>
+        </w:rPr>
+        <w:t>growth</w:t>
+      </w:r>
+      <w:r>
+        <w:rPr>
+          <w:rFonts w:ascii="Times New Roman" w:hAnsi="Times New Roman" w:cs="Times New Roman"/>
+          <w:bCs/>
+        </w:rPr>
+        <w:t>[</w:t>
+      </w:r>
+      <w:proofErr w:type="gramEnd"/>
+      <w:r>
+        <w:rPr>
+          <w:rFonts w:ascii="Times New Roman" w:hAnsi="Times New Roman" w:cs="Times New Roman"/>
+          <w:bCs/>
+        </w:rPr>
+        <w:t>2]</w:t>
+      </w:r>
+      <w:r>
+        <w:rPr>
+          <w:rFonts w:ascii="Times New Roman" w:hAnsi="Times New Roman" w:cs="Times New Roman"/>
+          <w:bCs/>
+        </w:rPr>
+        <w:t>.</w:t>
       </w:r>
       <w:r>
         <w:rPr>
@@ -316,14 +355,30 @@
           <w:rFonts w:ascii="Times New Roman" w:hAnsi="Times New Roman" w:cs="Times New Roman"/>
           <w:bCs/>
         </w:rPr>
-        <w:t xml:space="preserve"> median completion timelines exceeding five years, with only 13% reaching commercial operation</w:t>
-      </w:r>
-      <w:r>
-        <w:rPr>
-          <w:rFonts w:ascii="Times New Roman" w:hAnsi="Times New Roman" w:cs="Times New Roman"/>
-          <w:bCs/>
-        </w:rPr>
-        <w:t>[3]</w:t>
+        <w:t xml:space="preserve"> median completion timelines exceeding five years, with only 13% reaching commercial </w:t>
+      </w:r>
+      <w:proofErr w:type="gramStart"/>
+      <w:r>
+        <w:rPr>
+          <w:rFonts w:ascii="Times New Roman" w:hAnsi="Times New Roman" w:cs="Times New Roman"/>
+          <w:bCs/>
+        </w:rPr>
+        <w:t>operation</w:t>
+      </w:r>
+      <w:r>
+        <w:rPr>
+          <w:rFonts w:ascii="Times New Roman" w:hAnsi="Times New Roman" w:cs="Times New Roman"/>
+          <w:bCs/>
+        </w:rPr>
+        <w:t>[</w:t>
+      </w:r>
+      <w:proofErr w:type="gramEnd"/>
+      <w:r>
+        <w:rPr>
+          <w:rFonts w:ascii="Times New Roman" w:hAnsi="Times New Roman" w:cs="Times New Roman"/>
+          <w:bCs/>
+        </w:rPr>
+        <w:t>3]</w:t>
       </w:r>
       <w:r>
         <w:rPr>
@@ -481,14 +536,37 @@
           <w:rFonts w:ascii="Times New Roman" w:hAnsi="Times New Roman" w:cs="Times New Roman"/>
           <w:bCs/>
         </w:rPr>
-        <w:t>The IEA’s 2025 Energy and AI report finds that data-center flexibility for as little as 0.1% to 1% of annual hours would suffice to integrate all projected 2030 capacity additions into existing U.S., E.U., and Chinese electricity systems</w:t>
-      </w:r>
-      <w:r>
-        <w:rPr>
-          <w:rFonts w:ascii="Times New Roman" w:hAnsi="Times New Roman" w:cs="Times New Roman"/>
-          <w:bCs/>
-        </w:rPr>
-        <w:t>.[4]</w:t>
+        <w:t xml:space="preserve">The IEA’s 2025 Energy and AI report finds that data-center flexibility for as little as 0.1% to 1% of annual hours would suffice to integrate all projected 2030 capacity additions into existing U.S., E.U., and Chinese electricity </w:t>
+      </w:r>
+      <w:proofErr w:type="gramStart"/>
+      <w:r>
+        <w:rPr>
+          <w:rFonts w:ascii="Times New Roman" w:hAnsi="Times New Roman" w:cs="Times New Roman"/>
+          <w:bCs/>
+        </w:rPr>
+        <w:t>systems</w:t>
+      </w:r>
+      <w:r>
+        <w:rPr>
+          <w:rFonts w:ascii="Times New Roman" w:hAnsi="Times New Roman" w:cs="Times New Roman"/>
+          <w:bCs/>
+        </w:rPr>
+        <w:t>[</w:t>
+      </w:r>
+      <w:proofErr w:type="gramEnd"/>
+      <w:r>
+        <w:rPr>
+          <w:rFonts w:ascii="Times New Roman" w:hAnsi="Times New Roman" w:cs="Times New Roman"/>
+          <w:bCs/>
+        </w:rPr>
+        <w:t>4]</w:t>
+      </w:r>
+      <w:r>
+        <w:rPr>
+          <w:rFonts w:ascii="Times New Roman" w:hAnsi="Times New Roman" w:cs="Times New Roman"/>
+          <w:bCs/>
+        </w:rPr>
+        <w:t>.</w:t>
       </w:r>
       <w:r>
         <w:rPr>
@@ -887,14 +965,37 @@
           <w:rFonts w:ascii="Times New Roman" w:hAnsi="Times New Roman" w:cs="Times New Roman"/>
           <w:bCs/>
         </w:rPr>
-        <w:t xml:space="preserve"> for which inference is approximately 43% of IT compute, anchored in McKinsey's December 2025 projection that inference workloads will reach more than 40% of total data-center demand.</w:t>
-      </w:r>
-      <w:r>
-        <w:rPr>
-          <w:rFonts w:ascii="Times New Roman" w:hAnsi="Times New Roman" w:cs="Times New Roman"/>
-          <w:bCs/>
-        </w:rPr>
-        <w:t>[9]</w:t>
+        <w:t xml:space="preserve"> for which inference is approximately 43% of IT compute, anchored in McKinsey's December 2025 projection that inference workloads will reach more than 40% of total data-center </w:t>
+      </w:r>
+      <w:proofErr w:type="gramStart"/>
+      <w:r>
+        <w:rPr>
+          <w:rFonts w:ascii="Times New Roman" w:hAnsi="Times New Roman" w:cs="Times New Roman"/>
+          <w:bCs/>
+        </w:rPr>
+        <w:t>demand</w:t>
+      </w:r>
+      <w:r>
+        <w:rPr>
+          <w:rFonts w:ascii="Times New Roman" w:hAnsi="Times New Roman" w:cs="Times New Roman"/>
+          <w:bCs/>
+        </w:rPr>
+        <w:t>[</w:t>
+      </w:r>
+      <w:proofErr w:type="gramEnd"/>
+      <w:r>
+        <w:rPr>
+          <w:rFonts w:ascii="Times New Roman" w:hAnsi="Times New Roman" w:cs="Times New Roman"/>
+          <w:bCs/>
+        </w:rPr>
+        <w:t>9]</w:t>
+      </w:r>
+      <w:r>
+        <w:rPr>
+          <w:rFonts w:ascii="Times New Roman" w:hAnsi="Times New Roman" w:cs="Times New Roman"/>
+          <w:bCs/>
+        </w:rPr>
+        <w:t>.</w:t>
       </w:r>
       <w:r>
         <w:rPr>
@@ -903,12 +1004,21 @@
         </w:rPr>
         <w:t xml:space="preserve"> </w:t>
       </w:r>
-      <w:r>
-        <w:rPr>
-          <w:rFonts w:ascii="Times New Roman" w:hAnsi="Times New Roman" w:cs="Times New Roman"/>
-          <w:bCs/>
-        </w:rPr>
-        <w:t xml:space="preserve">The inference-dominant scenario, applies the cascade to purpose-built AI campuses for which inference exceeds 70% of IT compute, a class of facilities now emerging in industry and modeled distinctly in the IEA's 2025 </w:t>
+      <w:proofErr w:type="gramStart"/>
+      <w:r>
+        <w:rPr>
+          <w:rFonts w:ascii="Times New Roman" w:hAnsi="Times New Roman" w:cs="Times New Roman"/>
+          <w:bCs/>
+        </w:rPr>
+        <w:t>The inference-dominant scenario,</w:t>
+      </w:r>
+      <w:proofErr w:type="gramEnd"/>
+      <w:r>
+        <w:rPr>
+          <w:rFonts w:ascii="Times New Roman" w:hAnsi="Times New Roman" w:cs="Times New Roman"/>
+          <w:bCs/>
+        </w:rPr>
+        <w:t xml:space="preserve"> applies the cascade to purpose-built AI campuses for which inference exceeds 70% of IT compute, a class of facilities now emerging in industry and modeled distinctly in the IEA's 2025 </w:t>
       </w:r>
       <w:r>
         <w:rPr>
@@ -924,35 +1034,90 @@
           <w:rFonts w:ascii="Times New Roman" w:hAnsi="Times New Roman" w:cs="Times New Roman"/>
           <w:bCs/>
         </w:rPr>
-        <w:t xml:space="preserve"> report</w:t>
-      </w:r>
-      <w:r>
-        <w:rPr>
-          <w:rFonts w:ascii="Times New Roman" w:hAnsi="Times New Roman" w:cs="Times New Roman"/>
-          <w:bCs/>
-        </w:rPr>
-        <w:t>[4]</w:t>
-      </w:r>
-      <w:r>
-        <w:rPr>
-          <w:rFonts w:ascii="Times New Roman" w:hAnsi="Times New Roman" w:cs="Times New Roman"/>
-          <w:bCs/>
-        </w:rPr>
-        <w:t xml:space="preserve"> and in Zhou et al.'s 2024 analysis of AI-focused HPC.</w:t>
-      </w:r>
-      <w:r>
-        <w:rPr>
-          <w:rFonts w:ascii="Times New Roman" w:hAnsi="Times New Roman" w:cs="Times New Roman"/>
-          <w:bCs/>
-        </w:rPr>
-        <w:t>[10]</w:t>
-      </w:r>
-      <w:r>
-        <w:rPr>
-          <w:rFonts w:ascii="Times New Roman" w:hAnsi="Times New Roman" w:cs="Times New Roman"/>
-          <w:bCs/>
-        </w:rPr>
-        <w:t xml:space="preserve"> The two scenarios are reported in parallel because the actual 2030 fleet will include both, and the difference between their commitment depths is itself a finding: the marginal flexibility gain from purpose-built siting is decomposable.</w:t>
+        <w:t xml:space="preserve"> </w:t>
+      </w:r>
+      <w:proofErr w:type="gramStart"/>
+      <w:r>
+        <w:rPr>
+          <w:rFonts w:ascii="Times New Roman" w:hAnsi="Times New Roman" w:cs="Times New Roman"/>
+          <w:bCs/>
+        </w:rPr>
+        <w:t>report</w:t>
+      </w:r>
+      <w:r>
+        <w:rPr>
+          <w:rFonts w:ascii="Times New Roman" w:hAnsi="Times New Roman" w:cs="Times New Roman"/>
+          <w:bCs/>
+        </w:rPr>
+        <w:t>[</w:t>
+      </w:r>
+      <w:proofErr w:type="gramEnd"/>
+      <w:r>
+        <w:rPr>
+          <w:rFonts w:ascii="Times New Roman" w:hAnsi="Times New Roman" w:cs="Times New Roman"/>
+          <w:bCs/>
+        </w:rPr>
+        <w:t>4]</w:t>
+      </w:r>
+      <w:r>
+        <w:rPr>
+          <w:rFonts w:ascii="Times New Roman" w:hAnsi="Times New Roman" w:cs="Times New Roman"/>
+          <w:bCs/>
+        </w:rPr>
+        <w:t xml:space="preserve"> and in Zhou et al.'s 2024 analysis of AI-focused </w:t>
+      </w:r>
+      <w:proofErr w:type="gramStart"/>
+      <w:r>
+        <w:rPr>
+          <w:rFonts w:ascii="Times New Roman" w:hAnsi="Times New Roman" w:cs="Times New Roman"/>
+          <w:bCs/>
+        </w:rPr>
+        <w:t>HPC</w:t>
+      </w:r>
+      <w:r>
+        <w:rPr>
+          <w:rFonts w:ascii="Times New Roman" w:hAnsi="Times New Roman" w:cs="Times New Roman"/>
+          <w:bCs/>
+        </w:rPr>
+        <w:t>[</w:t>
+      </w:r>
+      <w:proofErr w:type="gramEnd"/>
+      <w:r>
+        <w:rPr>
+          <w:rFonts w:ascii="Times New Roman" w:hAnsi="Times New Roman" w:cs="Times New Roman"/>
+          <w:bCs/>
+        </w:rPr>
+        <w:t>10]</w:t>
+      </w:r>
+      <w:r>
+        <w:rPr>
+          <w:rFonts w:ascii="Times New Roman" w:hAnsi="Times New Roman" w:cs="Times New Roman"/>
+          <w:bCs/>
+        </w:rPr>
+        <w:t>.</w:t>
+      </w:r>
+      <w:r>
+        <w:rPr>
+          <w:rFonts w:ascii="Times New Roman" w:hAnsi="Times New Roman" w:cs="Times New Roman"/>
+          <w:bCs/>
+        </w:rPr>
+        <w:t xml:space="preserve"> The two scenarios are reported in parallel because the actual 2030 fleet will include both, and the difference between their commitment depths is itself a finding: the marginal flexibility gain from purpose-built </w:t>
+      </w:r>
+      <w:proofErr w:type="gramStart"/>
+      <w:r>
+        <w:rPr>
+          <w:rFonts w:ascii="Times New Roman" w:hAnsi="Times New Roman" w:cs="Times New Roman"/>
+          <w:bCs/>
+        </w:rPr>
+        <w:t>siting</w:t>
+      </w:r>
+      <w:proofErr w:type="gramEnd"/>
+      <w:r>
+        <w:rPr>
+          <w:rFonts w:ascii="Times New Roman" w:hAnsi="Times New Roman" w:cs="Times New Roman"/>
+          <w:bCs/>
+        </w:rPr>
+        <w:t xml:space="preserve"> is decomposable.</w:t>
       </w:r>
     </w:p>
     <w:p>
@@ -1024,7 +1189,30 @@
           <w:rFonts w:ascii="Times New Roman" w:hAnsi="Times New Roman" w:cs="Times New Roman"/>
           <w:bCs/>
         </w:rPr>
-        <w:t>Within each region we identify destination pricing zones co-located with data center facilities using county-level capacity data from the U.S. Department of Energy / National Renewable Energy Laboratory Accelerating Speed to Power Data Viewer</w:t>
+        <w:t xml:space="preserve">Within each region we identify destination pricing zones co-located with data center facilities using county-level capacity data from the U.S. Department of Energy / National Renewable Energy Laboratory Accelerating Speed to Power Data </w:t>
+      </w:r>
+      <w:proofErr w:type="gramStart"/>
+      <w:r>
+        <w:rPr>
+          <w:rFonts w:ascii="Times New Roman" w:hAnsi="Times New Roman" w:cs="Times New Roman"/>
+          <w:bCs/>
+        </w:rPr>
+        <w:t>Viewer</w:t>
+      </w:r>
+      <w:r>
+        <w:rPr>
+          <w:rFonts w:ascii="Times New Roman" w:hAnsi="Times New Roman" w:cs="Times New Roman"/>
+          <w:bCs/>
+        </w:rPr>
+        <w:t>[</w:t>
+      </w:r>
+      <w:proofErr w:type="gramEnd"/>
+      <w:r>
+        <w:rPr>
+          <w:rFonts w:ascii="Times New Roman" w:hAnsi="Times New Roman" w:cs="Times New Roman"/>
+          <w:bCs/>
+        </w:rPr>
+        <w:t>11]</w:t>
       </w:r>
       <w:r>
         <w:rPr>
@@ -1032,13 +1220,6 @@
           <w:bCs/>
         </w:rPr>
         <w:t>.</w:t>
-      </w:r>
-      <w:r>
-        <w:rPr>
-          <w:rFonts w:ascii="Times New Roman" w:hAnsi="Times New Roman" w:cs="Times New Roman"/>
-          <w:bCs/>
-        </w:rPr>
-        <w:t>[11]</w:t>
       </w:r>
       <w:r>
         <w:rPr>
@@ -1573,7 +1754,7 @@
           <w:rFonts w:ascii="Times New Roman" w:hAnsi="Times New Roman" w:cs="Times New Roman"/>
           <w:bCs/>
         </w:rPr>
-        <w:t xml:space="preserve"> = 0.43), the corresponding values are mean 24.6%, P5 23.7%, and CVaR 20.6%. The framework's conservatism at single-facility scale arises from a ratio effect: aggregate available headroom across unstressed destinations substantially exceeds the demand from a single migrating facility in </w:t>
+        <w:t xml:space="preserve"> = 0.43), the corresponding </w:t>
       </w:r>
       <w:proofErr w:type="gramStart"/>
       <w:r>
@@ -1581,6 +1762,36 @@
           <w:rFonts w:ascii="Times New Roman" w:hAnsi="Times New Roman" w:cs="Times New Roman"/>
           <w:bCs/>
         </w:rPr>
+        <w:t>values are</w:t>
+      </w:r>
+      <w:proofErr w:type="gramEnd"/>
+      <w:r>
+        <w:rPr>
+          <w:rFonts w:ascii="Times New Roman" w:hAnsi="Times New Roman" w:cs="Times New Roman"/>
+          <w:bCs/>
+        </w:rPr>
+        <w:t xml:space="preserve"> mean 24.6%, P5 23.7%, and </w:t>
+      </w:r>
+      <w:r>
+        <w:rPr>
+          <w:rFonts w:ascii="Times New Roman" w:hAnsi="Times New Roman" w:cs="Times New Roman"/>
+          <w:bCs/>
+        </w:rPr>
+        <w:t>conditional expected shortfall</w:t>
+      </w:r>
+      <w:r>
+        <w:rPr>
+          <w:rFonts w:ascii="Times New Roman" w:hAnsi="Times New Roman" w:cs="Times New Roman"/>
+          <w:bCs/>
+        </w:rPr>
+        <w:t xml:space="preserve"> 20.6%. The framework's conservatism at single-facility scale arises from a ratio effect: aggregate available headroom across unstressed destinations substantially exceeds the demand from a single migrating facility in </w:t>
+      </w:r>
+      <w:proofErr w:type="gramStart"/>
+      <w:r>
+        <w:rPr>
+          <w:rFonts w:ascii="Times New Roman" w:hAnsi="Times New Roman" w:cs="Times New Roman"/>
+          <w:bCs/>
+        </w:rPr>
         <w:t>the large majority of</w:t>
       </w:r>
       <w:proofErr w:type="gramEnd"/>
@@ -1590,122 +1801,6 @@
           <w:bCs/>
         </w:rPr>
         <w:t xml:space="preserve"> stress hours, and the deferral and DVFS mechanisms operate independently of destination contention.</w:t>
-      </w:r>
-    </w:p>
-    <w:p>
-      <w:pPr>
-        <w:rPr>
-          <w:rFonts w:ascii="Times New Roman" w:hAnsi="Times New Roman" w:cs="Times New Roman"/>
-          <w:bCs/>
-        </w:rPr>
-      </w:pPr>
-      <w:r>
-        <w:rPr>
-          <w:rFonts w:ascii="Times New Roman" w:hAnsi="Times New Roman" w:cs="Times New Roman"/>
-          <w:bCs/>
-        </w:rPr>
-        <w:t xml:space="preserve">When extended to simultaneous migration by geographically distributed facilities, commitment depth becomes </w:t>
-      </w:r>
-      <w:proofErr w:type="gramStart"/>
-      <w:r>
-        <w:rPr>
-          <w:rFonts w:ascii="Times New Roman" w:hAnsi="Times New Roman" w:cs="Times New Roman"/>
-          <w:bCs/>
-        </w:rPr>
-        <w:t>scale-dependent</w:t>
-      </w:r>
-      <w:proofErr w:type="gramEnd"/>
-      <w:r>
-        <w:rPr>
-          <w:rFonts w:ascii="Times New Roman" w:hAnsi="Times New Roman" w:cs="Times New Roman"/>
-          <w:bCs/>
-        </w:rPr>
-        <w:t xml:space="preserve">. We first evaluate an empirical fleet defined by the geographic distribution of PJM data center capacity across load zones, with per-hour co-stress identified from the intra-PJM coincidence matrix described in Section 3. Across the 30 ComEd stress hours where at least one other PJM zone is also stressed, the migrating fleet averages 4,729 MW (range 747–14,379 MW), with substantial variation driven by whether the Dominion zone in Northern Virginia (9,431 MW of data center capacity) is co-stressed with ComEd. This empirical fleet yields a mean commitment depth of 33.6% under inference-dominant scope and 21.1% under mixed-use, with conditional expected shortfall below the 5th percentile of 19.8% and 12.3% respectively. </w:t>
-      </w:r>
-      <w:r>
-        <w:rPr>
-          <w:rFonts w:ascii="Times New Roman" w:hAnsi="Times New Roman" w:cs="Times New Roman"/>
-          <w:bCs/>
-        </w:rPr>
-        <w:t>M</w:t>
-      </w:r>
-      <w:r>
-        <w:rPr>
-          <w:rFonts w:ascii="Times New Roman" w:hAnsi="Times New Roman" w:cs="Times New Roman"/>
-          <w:bCs/>
-        </w:rPr>
-        <w:t>apped through PJM's 92% demand-response ELCC, this fleet</w:t>
-      </w:r>
-      <w:r>
-        <w:rPr>
-          <w:rFonts w:ascii="Times New Roman" w:hAnsi="Times New Roman" w:cs="Times New Roman"/>
-          <w:bCs/>
-        </w:rPr>
-        <w:t xml:space="preserve"> would be credited</w:t>
-      </w:r>
-      <w:r>
-        <w:rPr>
-          <w:rFonts w:ascii="Times New Roman" w:hAnsi="Times New Roman" w:cs="Times New Roman"/>
-          <w:bCs/>
-        </w:rPr>
-        <w:t xml:space="preserve"> with approximately 19.4% (inference-dominant) or 12.1% (mixed-use) of accredited capacity per fleet MW.</w:t>
-      </w:r>
-    </w:p>
-    <w:p>
-      <w:pPr>
-        <w:rPr>
-          <w:rFonts w:ascii="Times New Roman" w:hAnsi="Times New Roman" w:cs="Times New Roman"/>
-          <w:bCs/>
-        </w:rPr>
-      </w:pPr>
-      <w:r>
-        <w:rPr>
-          <w:rFonts w:ascii="Times New Roman" w:hAnsi="Times New Roman" w:cs="Times New Roman"/>
-          <w:bCs/>
-        </w:rPr>
-        <w:t>We then evaluate commitment depth as a continuous function of fleet size using a parametric sweep from 0.5 to 15 GW. Under the inference-dominant scope, commitment depth declines from 39.8% at 1 GW to 38.5% at 10 GW</w:t>
-      </w:r>
-      <w:r>
-        <w:rPr>
-          <w:rFonts w:ascii="Times New Roman" w:hAnsi="Times New Roman" w:cs="Times New Roman"/>
-          <w:bCs/>
-        </w:rPr>
-        <w:t>; u</w:t>
-      </w:r>
-      <w:r>
-        <w:rPr>
-          <w:rFonts w:ascii="Times New Roman" w:hAnsi="Times New Roman" w:cs="Times New Roman"/>
-          <w:bCs/>
-        </w:rPr>
-        <w:t>nder the mixed-use scope,</w:t>
-      </w:r>
-      <w:r>
-        <w:rPr>
-          <w:rFonts w:ascii="Times New Roman" w:hAnsi="Times New Roman" w:cs="Times New Roman"/>
-          <w:bCs/>
-        </w:rPr>
-        <w:t xml:space="preserve"> </w:t>
-      </w:r>
-      <w:r>
-        <w:rPr>
-          <w:rFonts w:ascii="Times New Roman" w:hAnsi="Times New Roman" w:cs="Times New Roman"/>
-          <w:bCs/>
-        </w:rPr>
-        <w:t>from 24.6% at 1 GW to 24.1% at 10 GW. The decline is driven primarily by destination contention engaging spatial migration: the share of Monte Carlo draws that are destination-constrained rises from 4.9% at 1 GW to 25.7% at 10 GW under the inference-dominant scope, and from 3.0% to 8.5% under the mixed-use scope. Spatial contention does not exceed the 50% threshold within the swept range, with onset projected beyond 15 GW. The decline in mean commitment depth is mild because deferral and DVFS contribute additively across all fleet sizes and do not saturate within the range evaluated</w:t>
-      </w:r>
-      <w:r>
-        <w:rPr>
-          <w:rFonts w:ascii="Times New Roman" w:hAnsi="Times New Roman" w:cs="Times New Roman"/>
-          <w:bCs/>
-        </w:rPr>
-        <w:t>. T</w:t>
-      </w:r>
-      <w:r>
-        <w:rPr>
-          <w:rFonts w:ascii="Times New Roman" w:hAnsi="Times New Roman" w:cs="Times New Roman"/>
-          <w:bCs/>
-        </w:rPr>
-        <w:t>he 5th percentile shows a sharper decline (from 38.1% to 25.2% under inference-dominant; from 23.6% to 16.1% under mixed-use), reflecting that destination contention binds most aggressively in the worst stress hours.</w:t>
       </w:r>
     </w:p>
     <w:p>
@@ -1717,9 +1812,8 @@
         <w:rPr>
           <w:noProof/>
         </w:rPr>
-        <w:lastRenderedPageBreak/>
         <w:drawing>
-          <wp:inline distT="0" distB="0" distL="0" distR="0" wp14:anchorId="4FCB9AAE" wp14:editId="5AEEE321">
+          <wp:inline distT="0" distB="0" distL="0" distR="0" wp14:anchorId="718304BF" wp14:editId="4A5A16D0">
             <wp:extent cx="5943600" cy="4166235"/>
             <wp:effectExtent l="0" t="0" r="0" b="5715"/>
             <wp:docPr id="1071194271" name="Picture 1"/>
@@ -1779,8 +1873,9 @@
           <w:sz w:val="18"/>
           <w:szCs w:val="18"/>
         </w:rPr>
-        <w:t>Fig</w:t>
-      </w:r>
+        <w:t>Fig. 2. Conditional Monte Carlo commitment depth distributions and scale dependence, ComEd source zone, 2022–2025. (a) Single-facility (500 MW) commitment depth distribution under inference-dominant scope (</w:t>
+      </w:r>
+      <w:proofErr w:type="spellStart"/>
       <w:r>
         <w:rPr>
           <w:i/>
@@ -1789,8 +1884,9 @@
           <w:sz w:val="18"/>
           <w:szCs w:val="18"/>
         </w:rPr>
-        <w:t xml:space="preserve">. </w:t>
-      </w:r>
+        <w:t>φ_inf</w:t>
+      </w:r>
+      <w:proofErr w:type="spellEnd"/>
       <w:r>
         <w:rPr>
           <w:i/>
@@ -1799,8 +1895,9 @@
           <w:sz w:val="18"/>
           <w:szCs w:val="18"/>
         </w:rPr>
-        <w:t>2</w:t>
-      </w:r>
+        <w:t xml:space="preserve"> = 0.70, primary distribution) with mixed-use scope (</w:t>
+      </w:r>
+      <w:proofErr w:type="spellStart"/>
       <w:r>
         <w:rPr>
           <w:i/>
@@ -1809,8 +1906,9 @@
           <w:sz w:val="18"/>
           <w:szCs w:val="18"/>
         </w:rPr>
-        <w:t>.</w:t>
-      </w:r>
+        <w:t>φ_inf</w:t>
+      </w:r>
+      <w:proofErr w:type="spellEnd"/>
       <w:r>
         <w:rPr>
           <w:i/>
@@ -1819,8 +1917,9 @@
           <w:sz w:val="18"/>
           <w:szCs w:val="18"/>
         </w:rPr>
-        <w:t xml:space="preserve"> </w:t>
-      </w:r>
+        <w:t xml:space="preserve"> = 0.43) overlaid in lower opacity. Mean 40.0% inference-dominant, 24.6% </w:t>
+      </w:r>
+      <w:proofErr w:type="gramStart"/>
       <w:r>
         <w:rPr>
           <w:i/>
@@ -1829,9 +1928,9 @@
           <w:sz w:val="18"/>
           <w:szCs w:val="18"/>
         </w:rPr>
-        <w:t>Conditional Monte Carlo commitment depth distributions and scale dependence, ComEd source zone, 2022–2025. (a) Single-facility (500 MW) commitment depth distribution under inference-dominant scope (</w:t>
-      </w:r>
-      <w:proofErr w:type="spellStart"/>
+        <w:t>mixed-use;</w:t>
+      </w:r>
+      <w:proofErr w:type="gramEnd"/>
       <w:r>
         <w:rPr>
           <w:i/>
@@ -1840,9 +1939,9 @@
           <w:sz w:val="18"/>
           <w:szCs w:val="18"/>
         </w:rPr>
-        <w:t>φ_inf</w:t>
-      </w:r>
-      <w:proofErr w:type="spellEnd"/>
+        <w:t xml:space="preserve"> 5th percentiles 38.5% and 23.7%. (b) Empirical fleet commitment depth distribution across 30 ComEd stress hours where at least one other PJM zone is also stressed; migrating fleet ranges 747–14,379 MW. Mean 33.6% inference-dominant, 21.1% mixed-use. (c) Per-GW commitment depth </w:t>
+      </w:r>
+      <w:proofErr w:type="gramStart"/>
       <w:r>
         <w:rPr>
           <w:i/>
@@ -1851,9 +1950,9 @@
           <w:sz w:val="18"/>
           <w:szCs w:val="18"/>
         </w:rPr>
-        <w:t xml:space="preserve"> = 0.70, primary distribution) with mixed-use scope (</w:t>
-      </w:r>
-      <w:proofErr w:type="spellStart"/>
+        <w:t>sweep</w:t>
+      </w:r>
+      <w:proofErr w:type="gramEnd"/>
       <w:r>
         <w:rPr>
           <w:i/>
@@ -1862,61 +1961,6 @@
           <w:sz w:val="18"/>
           <w:szCs w:val="18"/>
         </w:rPr>
-        <w:t>φ_inf</w:t>
-      </w:r>
-      <w:proofErr w:type="spellEnd"/>
-      <w:r>
-        <w:rPr>
-          <w:i/>
-          <w:iCs/>
-          <w:color w:val="0E2841" w:themeColor="text2"/>
-          <w:sz w:val="18"/>
-          <w:szCs w:val="18"/>
-        </w:rPr>
-        <w:t xml:space="preserve"> = 0.43) overlaid in lower opacity. Mean 40.0% inference-dominant, 24.6% </w:t>
-      </w:r>
-      <w:proofErr w:type="gramStart"/>
-      <w:r>
-        <w:rPr>
-          <w:i/>
-          <w:iCs/>
-          <w:color w:val="0E2841" w:themeColor="text2"/>
-          <w:sz w:val="18"/>
-          <w:szCs w:val="18"/>
-        </w:rPr>
-        <w:t>mixed-use;</w:t>
-      </w:r>
-      <w:proofErr w:type="gramEnd"/>
-      <w:r>
-        <w:rPr>
-          <w:i/>
-          <w:iCs/>
-          <w:color w:val="0E2841" w:themeColor="text2"/>
-          <w:sz w:val="18"/>
-          <w:szCs w:val="18"/>
-        </w:rPr>
-        <w:t xml:space="preserve"> 5th percentiles 38.5% and 23.7%. (b) Empirical fleet commitment depth distribution across 30 ComEd stress hours where at least one other PJM zone is also stressed; migrating fleet ranges 747–14,379 MW. Mean 33.6% inference-dominant, 21.1% mixed-use. (c) Per-GW commitment depth </w:t>
-      </w:r>
-      <w:proofErr w:type="gramStart"/>
-      <w:r>
-        <w:rPr>
-          <w:i/>
-          <w:iCs/>
-          <w:color w:val="0E2841" w:themeColor="text2"/>
-          <w:sz w:val="18"/>
-          <w:szCs w:val="18"/>
-        </w:rPr>
-        <w:t>sweep</w:t>
-      </w:r>
-      <w:proofErr w:type="gramEnd"/>
-      <w:r>
-        <w:rPr>
-          <w:i/>
-          <w:iCs/>
-          <w:color w:val="0E2841" w:themeColor="text2"/>
-          <w:sz w:val="18"/>
-          <w:szCs w:val="18"/>
-        </w:rPr>
         <w:t xml:space="preserve"> from 0.5 to 15 GW under both scopes, with mean curves and P5–P95 bands; the secondary axis (right) shows the percentage of Monte Carlo draws destination-constrained, rising from 4.9% at 1 GW to 25.7% at 10 GW under the inference-dominant scope. 2,000 draws per stress hour; full parameter specification in Methods Table M1</w:t>
       </w:r>
     </w:p>
@@ -1925,6 +1969,153 @@
         <w:rPr>
           <w:rFonts w:ascii="Times New Roman" w:hAnsi="Times New Roman" w:cs="Times New Roman"/>
           <w:bCs/>
+        </w:rPr>
+      </w:pPr>
+      <w:r>
+        <w:rPr>
+          <w:rFonts w:ascii="Times New Roman" w:hAnsi="Times New Roman" w:cs="Times New Roman"/>
+          <w:bCs/>
+        </w:rPr>
+        <w:lastRenderedPageBreak/>
+        <w:t xml:space="preserve">When extended to simultaneous migration by geographically distributed facilities, commitment depth becomes </w:t>
+      </w:r>
+      <w:proofErr w:type="gramStart"/>
+      <w:r>
+        <w:rPr>
+          <w:rFonts w:ascii="Times New Roman" w:hAnsi="Times New Roman" w:cs="Times New Roman"/>
+          <w:bCs/>
+        </w:rPr>
+        <w:t>scale-dependent</w:t>
+      </w:r>
+      <w:proofErr w:type="gramEnd"/>
+      <w:r>
+        <w:rPr>
+          <w:rFonts w:ascii="Times New Roman" w:hAnsi="Times New Roman" w:cs="Times New Roman"/>
+          <w:bCs/>
+        </w:rPr>
+        <w:t xml:space="preserve">. We first evaluate an empirical fleet defined by the geographic distribution of PJM data center capacity across load zones, with per-hour co-stress identified from the intra-PJM coincidence matrix described in Section 3. Across the 30 ComEd stress hours where at least one other PJM zone is also stressed, the migrating fleet averages 4,729 MW (range 747–14,379 MW), with substantial variation driven by whether the Dominion zone in Northern Virginia (9,431 MW of data center </w:t>
+      </w:r>
+      <w:proofErr w:type="gramStart"/>
+      <w:r>
+        <w:rPr>
+          <w:rFonts w:ascii="Times New Roman" w:hAnsi="Times New Roman" w:cs="Times New Roman"/>
+          <w:bCs/>
+        </w:rPr>
+        <w:t>capacity)</w:t>
+      </w:r>
+      <w:r>
+        <w:rPr>
+          <w:rFonts w:ascii="Times New Roman" w:hAnsi="Times New Roman" w:cs="Times New Roman"/>
+          <w:bCs/>
+        </w:rPr>
+        <w:t>[</w:t>
+      </w:r>
+      <w:proofErr w:type="gramEnd"/>
+      <w:r>
+        <w:rPr>
+          <w:rFonts w:ascii="Times New Roman" w:hAnsi="Times New Roman" w:cs="Times New Roman"/>
+          <w:bCs/>
+        </w:rPr>
+        <w:t>13]</w:t>
+      </w:r>
+      <w:r>
+        <w:rPr>
+          <w:rFonts w:ascii="Times New Roman" w:hAnsi="Times New Roman" w:cs="Times New Roman"/>
+          <w:bCs/>
+        </w:rPr>
+        <w:t xml:space="preserve"> is co-stressed with ComEd. This empirical fleet yields a mean commitment depth of 33.6% under inference-dominant scope and 21.1% under mixed-use, with conditional expected shortfall below the 5th percentile of 19.8% and 12.3% respectively. </w:t>
+      </w:r>
+      <w:r>
+        <w:rPr>
+          <w:rFonts w:ascii="Times New Roman" w:hAnsi="Times New Roman" w:cs="Times New Roman"/>
+          <w:bCs/>
+        </w:rPr>
+        <w:t>M</w:t>
+      </w:r>
+      <w:r>
+        <w:rPr>
+          <w:rFonts w:ascii="Times New Roman" w:hAnsi="Times New Roman" w:cs="Times New Roman"/>
+          <w:bCs/>
+        </w:rPr>
+        <w:t>apped through PJM's 92% demand-response ELCC, this fleet</w:t>
+      </w:r>
+      <w:r>
+        <w:rPr>
+          <w:rFonts w:ascii="Times New Roman" w:hAnsi="Times New Roman" w:cs="Times New Roman"/>
+          <w:bCs/>
+        </w:rPr>
+        <w:t xml:space="preserve"> would be credited</w:t>
+      </w:r>
+      <w:r>
+        <w:rPr>
+          <w:rFonts w:ascii="Times New Roman" w:hAnsi="Times New Roman" w:cs="Times New Roman"/>
+          <w:bCs/>
+        </w:rPr>
+        <w:t xml:space="preserve"> with approximately 19.4% (inference-dominant) or 12.1% (mixed-use) of accredited capacity per fleet MW.</w:t>
+      </w:r>
+    </w:p>
+    <w:p>
+      <w:pPr>
+        <w:rPr>
+          <w:rFonts w:ascii="Times New Roman" w:hAnsi="Times New Roman" w:cs="Times New Roman"/>
+          <w:bCs/>
+        </w:rPr>
+      </w:pPr>
+      <w:r>
+        <w:rPr>
+          <w:rFonts w:ascii="Times New Roman" w:hAnsi="Times New Roman" w:cs="Times New Roman"/>
+          <w:bCs/>
+        </w:rPr>
+        <w:t>We then evaluate commitment depth as a continuous function of fleet size using a parametric sweep from 0.5 to 15 GW. Under the inference-dominant scope, commitment depth declines from 39.8% at 1 GW to 38.5% at 10 GW</w:t>
+      </w:r>
+      <w:r>
+        <w:rPr>
+          <w:rFonts w:ascii="Times New Roman" w:hAnsi="Times New Roman" w:cs="Times New Roman"/>
+          <w:bCs/>
+        </w:rPr>
+        <w:t>; u</w:t>
+      </w:r>
+      <w:r>
+        <w:rPr>
+          <w:rFonts w:ascii="Times New Roman" w:hAnsi="Times New Roman" w:cs="Times New Roman"/>
+          <w:bCs/>
+        </w:rPr>
+        <w:t>nder the mixed-use scope,</w:t>
+      </w:r>
+      <w:r>
+        <w:rPr>
+          <w:rFonts w:ascii="Times New Roman" w:hAnsi="Times New Roman" w:cs="Times New Roman"/>
+          <w:bCs/>
+        </w:rPr>
+        <w:t xml:space="preserve"> </w:t>
+      </w:r>
+      <w:r>
+        <w:rPr>
+          <w:rFonts w:ascii="Times New Roman" w:hAnsi="Times New Roman" w:cs="Times New Roman"/>
+          <w:bCs/>
+        </w:rPr>
+        <w:t>from 24.6% at 1 GW to 24.1% at 10 GW. The decline is driven primarily by destination contention engaging spatial migration: the share of Monte Carlo draws that are destination-constrained rises from 4.9% at 1 GW to 25.7% at 10 GW under the inference-dominant scope, and from 3.0% to 8.5% under the mixed-use scope. Spatial contention does not exceed the 50% threshold within the swept range, with onset projected beyond 15 GW. The decline in mean commitment depth is mild because deferral and DVFS contribute additively across all fleet sizes and do not saturate within the range evaluated</w:t>
+      </w:r>
+      <w:r>
+        <w:rPr>
+          <w:rFonts w:ascii="Times New Roman" w:hAnsi="Times New Roman" w:cs="Times New Roman"/>
+          <w:bCs/>
+        </w:rPr>
+        <w:t>. T</w:t>
+      </w:r>
+      <w:r>
+        <w:rPr>
+          <w:rFonts w:ascii="Times New Roman" w:hAnsi="Times New Roman" w:cs="Times New Roman"/>
+          <w:bCs/>
+        </w:rPr>
+        <w:t>he 5th percentile shows a sharper decline (from 38.1% to 25.2% under inference-dominant; from 23.6% to 16.1% under mixed-use), reflecting that destination contention binds most aggressively in the worst stress hours.</w:t>
+      </w:r>
+    </w:p>
+    <w:p>
+      <w:pPr>
+        <w:rPr>
+          <w:rFonts w:ascii="Times New Roman" w:hAnsi="Times New Roman" w:cs="Times New Roman"/>
+          <w:bCs/>
           <w:sz w:val="28"/>
           <w:szCs w:val="28"/>
         </w:rPr>
@@ -1989,7 +2180,21 @@
           <w:rFonts w:ascii="Times New Roman" w:hAnsi="Times New Roman" w:cs="Times New Roman"/>
           <w:bCs/>
         </w:rPr>
-        <w:t>13]</w:t>
+        <w:t>1</w:t>
+      </w:r>
+      <w:r>
+        <w:rPr>
+          <w:rFonts w:ascii="Times New Roman" w:hAnsi="Times New Roman" w:cs="Times New Roman"/>
+          <w:bCs/>
+        </w:rPr>
+        <w:t>4</w:t>
+      </w:r>
+      <w:r>
+        <w:rPr>
+          <w:rFonts w:ascii="Times New Roman" w:hAnsi="Times New Roman" w:cs="Times New Roman"/>
+          <w:bCs/>
+        </w:rPr>
+        <w:t>]</w:t>
       </w:r>
       <w:r>
         <w:rPr>
@@ -2052,6 +2257,34 @@
           <w:rFonts w:ascii="Times New Roman" w:hAnsi="Times New Roman" w:cs="Times New Roman"/>
           <w:bCs/>
         </w:rPr>
+        <w:t xml:space="preserve"> $638M</w:t>
+      </w:r>
+      <w:r>
+        <w:rPr>
+          <w:rFonts w:ascii="Times New Roman" w:hAnsi="Times New Roman" w:cs="Times New Roman"/>
+          <w:bCs/>
+        </w:rPr>
+        <w:t>/yr</w:t>
+      </w:r>
+      <w:r>
+        <w:rPr>
+          <w:rFonts w:ascii="Times New Roman" w:hAnsi="Times New Roman" w:cs="Times New Roman"/>
+          <w:bCs/>
+        </w:rPr>
+        <w:t xml:space="preserve"> for a 10 GW fleet</w:t>
+      </w:r>
+      <w:r>
+        <w:rPr>
+          <w:rFonts w:ascii="Times New Roman" w:hAnsi="Times New Roman" w:cs="Times New Roman"/>
+          <w:bCs/>
+        </w:rPr>
+        <w:t>, and respectively $41M/$399M under mixed-use scope.</w:t>
+      </w:r>
+      <w:r>
+        <w:rPr>
+          <w:rFonts w:ascii="Times New Roman" w:hAnsi="Times New Roman" w:cs="Times New Roman"/>
+          <w:bCs/>
+        </w:rPr>
         <w:t xml:space="preserve"> </w:t>
       </w:r>
       <w:r>
@@ -2059,106 +2292,78 @@
           <w:rFonts w:ascii="Times New Roman" w:hAnsi="Times New Roman" w:cs="Times New Roman"/>
           <w:bCs/>
         </w:rPr>
+        <w:t xml:space="preserve">From the operator’s perspective, interconnection acceleration </w:t>
+      </w:r>
+      <w:r>
+        <w:rPr>
+          <w:rFonts w:ascii="Times New Roman" w:hAnsi="Times New Roman" w:cs="Times New Roman"/>
+          <w:bCs/>
+        </w:rPr>
+        <w:t xml:space="preserve">could provide </w:t>
+      </w:r>
+      <w:r>
+        <w:rPr>
+          <w:rFonts w:ascii="Times New Roman" w:hAnsi="Times New Roman" w:cs="Times New Roman"/>
+          <w:bCs/>
+        </w:rPr>
+        <w:t>a far</w:t>
+      </w:r>
+      <w:r>
+        <w:rPr>
+          <w:rFonts w:ascii="Times New Roman" w:hAnsi="Times New Roman" w:cs="Times New Roman"/>
+          <w:bCs/>
+        </w:rPr>
+        <w:t xml:space="preserve"> larger incentive: using a three-year acceleration window for a 1 GW facility, central NPV is approximately $23.1B</w:t>
+      </w:r>
+      <w:r>
+        <w:rPr>
+          <w:rFonts w:ascii="Times New Roman" w:hAnsi="Times New Roman" w:cs="Times New Roman"/>
+          <w:bCs/>
+        </w:rPr>
+        <w:t xml:space="preserve"> (Methods; Extended Data Table 2),</w:t>
+      </w:r>
+      <w:r>
+        <w:rPr>
+          <w:rFonts w:ascii="Times New Roman" w:hAnsi="Times New Roman" w:cs="Times New Roman"/>
+          <w:bCs/>
+        </w:rPr>
+        <w:t xml:space="preserve"> </w:t>
+      </w:r>
+      <w:r>
+        <w:rPr>
+          <w:rFonts w:ascii="Times New Roman" w:hAnsi="Times New Roman" w:cs="Times New Roman"/>
+          <w:bCs/>
+        </w:rPr>
+        <w:t xml:space="preserve">significantly </w:t>
+      </w:r>
+      <w:r>
+        <w:rPr>
+          <w:rFonts w:ascii="Times New Roman" w:hAnsi="Times New Roman" w:cs="Times New Roman"/>
+          <w:bCs/>
+        </w:rPr>
+        <w:t>excee</w:t>
+      </w:r>
+      <w:r>
+        <w:rPr>
+          <w:rFonts w:ascii="Times New Roman" w:hAnsi="Times New Roman" w:cs="Times New Roman"/>
+          <w:bCs/>
+        </w:rPr>
+        <w:t>ding</w:t>
+      </w:r>
+      <w:r>
+        <w:rPr>
+          <w:rFonts w:ascii="Times New Roman" w:hAnsi="Times New Roman" w:cs="Times New Roman"/>
+          <w:bCs/>
+        </w:rPr>
+        <w:t xml:space="preserve"> the present value of avoided capacity </w:t>
+      </w:r>
+      <w:r>
+        <w:rPr>
+          <w:rFonts w:ascii="Times New Roman" w:hAnsi="Times New Roman" w:cs="Times New Roman"/>
+          <w:bCs/>
+        </w:rPr>
         <w:lastRenderedPageBreak/>
-        <w:t>$638M</w:t>
-      </w:r>
-      <w:r>
-        <w:rPr>
-          <w:rFonts w:ascii="Times New Roman" w:hAnsi="Times New Roman" w:cs="Times New Roman"/>
-          <w:bCs/>
-        </w:rPr>
-        <w:t>/yr</w:t>
-      </w:r>
-      <w:r>
-        <w:rPr>
-          <w:rFonts w:ascii="Times New Roman" w:hAnsi="Times New Roman" w:cs="Times New Roman"/>
-          <w:bCs/>
-        </w:rPr>
-        <w:t xml:space="preserve"> for a 10 GW fleet</w:t>
-      </w:r>
-      <w:r>
-        <w:rPr>
-          <w:rFonts w:ascii="Times New Roman" w:hAnsi="Times New Roman" w:cs="Times New Roman"/>
-          <w:bCs/>
-        </w:rPr>
-        <w:t>, and respectively $41M/$399M under mixed-use scope.</w:t>
-      </w:r>
-      <w:r>
-        <w:rPr>
-          <w:rFonts w:ascii="Times New Roman" w:hAnsi="Times New Roman" w:cs="Times New Roman"/>
-          <w:bCs/>
-        </w:rPr>
-        <w:t xml:space="preserve"> </w:t>
-      </w:r>
-      <w:r>
-        <w:rPr>
-          <w:rFonts w:ascii="Times New Roman" w:hAnsi="Times New Roman" w:cs="Times New Roman"/>
-          <w:bCs/>
-        </w:rPr>
-        <w:t xml:space="preserve">From the operator’s perspective, interconnection acceleration </w:t>
-      </w:r>
-      <w:r>
-        <w:rPr>
-          <w:rFonts w:ascii="Times New Roman" w:hAnsi="Times New Roman" w:cs="Times New Roman"/>
-          <w:bCs/>
-        </w:rPr>
-        <w:t xml:space="preserve">could provide </w:t>
-      </w:r>
-      <w:r>
-        <w:rPr>
-          <w:rFonts w:ascii="Times New Roman" w:hAnsi="Times New Roman" w:cs="Times New Roman"/>
-          <w:bCs/>
-        </w:rPr>
-        <w:t>a far</w:t>
-      </w:r>
-      <w:r>
-        <w:rPr>
-          <w:rFonts w:ascii="Times New Roman" w:hAnsi="Times New Roman" w:cs="Times New Roman"/>
-          <w:bCs/>
-        </w:rPr>
-        <w:t xml:space="preserve"> larger incentive: using a three-year acceleration window for a 1 GW facility, central NPV is approximately $23.1B</w:t>
-      </w:r>
-      <w:r>
-        <w:rPr>
-          <w:rFonts w:ascii="Times New Roman" w:hAnsi="Times New Roman" w:cs="Times New Roman"/>
-          <w:bCs/>
-        </w:rPr>
-        <w:t xml:space="preserve"> (Methods; Extended Data Table 2),</w:t>
-      </w:r>
-      <w:r>
-        <w:rPr>
-          <w:rFonts w:ascii="Times New Roman" w:hAnsi="Times New Roman" w:cs="Times New Roman"/>
-          <w:bCs/>
-        </w:rPr>
-        <w:t xml:space="preserve"> </w:t>
-      </w:r>
-      <w:r>
-        <w:rPr>
-          <w:rFonts w:ascii="Times New Roman" w:hAnsi="Times New Roman" w:cs="Times New Roman"/>
-          <w:bCs/>
-        </w:rPr>
-        <w:t xml:space="preserve">significantly </w:t>
-      </w:r>
-      <w:r>
-        <w:rPr>
-          <w:rFonts w:ascii="Times New Roman" w:hAnsi="Times New Roman" w:cs="Times New Roman"/>
-          <w:bCs/>
-        </w:rPr>
-        <w:t>excee</w:t>
-      </w:r>
-      <w:r>
-        <w:rPr>
-          <w:rFonts w:ascii="Times New Roman" w:hAnsi="Times New Roman" w:cs="Times New Roman"/>
-          <w:bCs/>
-        </w:rPr>
-        <w:t>ding</w:t>
-      </w:r>
-      <w:r>
-        <w:rPr>
-          <w:rFonts w:ascii="Times New Roman" w:hAnsi="Times New Roman" w:cs="Times New Roman"/>
-          <w:bCs/>
-        </w:rPr>
-        <w:t xml:space="preserve"> the present value of avoided capacity payments over a comparable horizon</w:t>
+        <w:t>payments over a comparable horizon</w:t>
       </w:r>
       <w:r>
         <w:rPr>
@@ -2288,6 +2493,34 @@
         </w:rPr>
         <w:t xml:space="preserve">The concentrated uncertainty is decision-relevant rather than irreducible. </w:t>
       </w:r>
+      <w:r>
+        <w:rPr>
+          <w:rFonts w:ascii="Times New Roman" w:hAnsi="Times New Roman" w:cs="Times New Roman"/>
+          <w:bCs/>
+        </w:rPr>
+        <w:t>D</w:t>
+      </w:r>
+      <w:r>
+        <w:rPr>
+          <w:rFonts w:ascii="Times New Roman" w:hAnsi="Times New Roman" w:cs="Times New Roman"/>
+          <w:bCs/>
+        </w:rPr>
+        <w:t>estination compute absorption</w:t>
+      </w:r>
+      <w:r>
+        <w:rPr>
+          <w:rFonts w:ascii="Times New Roman" w:hAnsi="Times New Roman" w:cs="Times New Roman"/>
+          <w:bCs/>
+        </w:rPr>
+        <w:t xml:space="preserve"> </w:t>
+      </w:r>
+      <w:r>
+        <w:rPr>
+          <w:rFonts w:ascii="Times New Roman" w:hAnsi="Times New Roman" w:cs="Times New Roman"/>
+          <w:bCs/>
+        </w:rPr>
+        <w:t>(</w:t>
+      </w:r>
       <w:proofErr w:type="spellStart"/>
       <w:r>
         <w:rPr>
@@ -2302,8 +2535,43 @@
           <w:rFonts w:ascii="Times New Roman" w:hAnsi="Times New Roman" w:cs="Times New Roman"/>
           <w:bCs/>
         </w:rPr>
+        <w:t>)</w:t>
+      </w:r>
+      <w:r>
+        <w:rPr>
+          <w:rFonts w:ascii="Times New Roman" w:hAnsi="Times New Roman" w:cs="Times New Roman"/>
+          <w:bCs/>
+        </w:rPr>
         <w:t xml:space="preserve"> reflects how much GPU headroom operators choose to maintain at destination facilities, the compatibility of destination hardware with source workloads, and the aggressiveness of model weight pre-staging, each of which is an operational decision, not a physical constraint. </w:t>
       </w:r>
+      <w:r>
+        <w:rPr>
+          <w:rFonts w:ascii="Times New Roman" w:hAnsi="Times New Roman" w:cs="Times New Roman"/>
+          <w:bCs/>
+        </w:rPr>
+        <w:t>T</w:t>
+      </w:r>
+      <w:r>
+        <w:rPr>
+          <w:rFonts w:ascii="Times New Roman" w:hAnsi="Times New Roman" w:cs="Times New Roman"/>
+          <w:bCs/>
+        </w:rPr>
+        <w:t>he unpinned fraction of migration eligibility</w:t>
+      </w:r>
+      <w:r>
+        <w:rPr>
+          <w:rFonts w:ascii="Times New Roman" w:hAnsi="Times New Roman" w:cs="Times New Roman"/>
+          <w:bCs/>
+        </w:rPr>
+        <w:t xml:space="preserve"> </w:t>
+      </w:r>
+      <w:r>
+        <w:rPr>
+          <w:rFonts w:ascii="Times New Roman" w:hAnsi="Times New Roman" w:cs="Times New Roman"/>
+          <w:bCs/>
+        </w:rPr>
+        <w:t>(</w:t>
+      </w:r>
       <w:proofErr w:type="spellStart"/>
       <w:r>
         <w:rPr>
@@ -2318,7 +2586,79 @@
           <w:rFonts w:ascii="Times New Roman" w:hAnsi="Times New Roman" w:cs="Times New Roman"/>
           <w:bCs/>
         </w:rPr>
-        <w:t xml:space="preserve"> Component B reflects contractual workload pinning, a commercial property that standardized DR-participation contract language could tighten. QUEUE_OK reflects whether multiple facilities defer into coordinated or uncoordinated recovery windows; aggregator-level visibility would directly reduce the fleet-scale saturation.</w:t>
+        <w:t xml:space="preserve"> Component B</w:t>
+      </w:r>
+      <w:r>
+        <w:rPr>
+          <w:rFonts w:ascii="Times New Roman" w:hAnsi="Times New Roman" w:cs="Times New Roman"/>
+          <w:bCs/>
+        </w:rPr>
+        <w:t>)</w:t>
+      </w:r>
+      <w:r>
+        <w:rPr>
+          <w:rFonts w:ascii="Times New Roman" w:hAnsi="Times New Roman" w:cs="Times New Roman"/>
+          <w:bCs/>
+        </w:rPr>
+        <w:t xml:space="preserve"> reflects contractual workload pinning, a commercial property that standardized DR-participation contract language could tighten. </w:t>
+      </w:r>
+      <w:r>
+        <w:rPr>
+          <w:rFonts w:ascii="Times New Roman" w:hAnsi="Times New Roman" w:cs="Times New Roman"/>
+          <w:bCs/>
+        </w:rPr>
+        <w:t>P</w:t>
+      </w:r>
+      <w:r>
+        <w:rPr>
+          <w:rFonts w:ascii="Times New Roman" w:hAnsi="Times New Roman" w:cs="Times New Roman"/>
+          <w:bCs/>
+        </w:rPr>
+        <w:t>ost-stress queue absorption at fleet scale</w:t>
+      </w:r>
+      <w:r>
+        <w:rPr>
+          <w:rFonts w:ascii="Times New Roman" w:hAnsi="Times New Roman" w:cs="Times New Roman"/>
+          <w:bCs/>
+        </w:rPr>
+        <w:t xml:space="preserve"> </w:t>
+      </w:r>
+      <w:r>
+        <w:rPr>
+          <w:rFonts w:ascii="Times New Roman" w:hAnsi="Times New Roman" w:cs="Times New Roman"/>
+          <w:bCs/>
+        </w:rPr>
+        <w:t>(</w:t>
+      </w:r>
+      <w:proofErr w:type="spellStart"/>
+      <w:r>
+        <w:rPr>
+          <w:rFonts w:ascii="Times New Roman" w:hAnsi="Times New Roman" w:cs="Times New Roman"/>
+          <w:bCs/>
+        </w:rPr>
+        <w:t>QUEUE_</w:t>
+      </w:r>
+      <w:r>
+        <w:rPr>
+          <w:rFonts w:ascii="Times New Roman" w:hAnsi="Times New Roman" w:cs="Times New Roman"/>
+          <w:bCs/>
+        </w:rPr>
+        <w:t>ok</w:t>
+      </w:r>
+      <w:proofErr w:type="spellEnd"/>
+      <w:r>
+        <w:rPr>
+          <w:rFonts w:ascii="Times New Roman" w:hAnsi="Times New Roman" w:cs="Times New Roman"/>
+          <w:bCs/>
+        </w:rPr>
+        <w:t>)</w:t>
+      </w:r>
+      <w:r>
+        <w:rPr>
+          <w:rFonts w:ascii="Times New Roman" w:hAnsi="Times New Roman" w:cs="Times New Roman"/>
+          <w:bCs/>
+        </w:rPr>
+        <w:t xml:space="preserve"> reflects whether multiple facilities defer into coordinated or uncoordinated recovery windows; aggregator-level visibility would directly reduce the fleet-scale saturation.</w:t>
       </w:r>
     </w:p>
     <w:p>
@@ -2333,7 +2673,21 @@
           <w:rFonts w:ascii="Times New Roman" w:hAnsi="Times New Roman" w:cs="Times New Roman"/>
           <w:bCs/>
         </w:rPr>
-        <w:t>Sensitivity analysis confirms that the three institutional parameters drive most of the framework's residual uncertainty</w:t>
+        <w:t>Sensitivity analysis confirms that the</w:t>
+      </w:r>
+      <w:r>
+        <w:rPr>
+          <w:rFonts w:ascii="Times New Roman" w:hAnsi="Times New Roman" w:cs="Times New Roman"/>
+          <w:bCs/>
+        </w:rPr>
+        <w:t>se</w:t>
+      </w:r>
+      <w:r>
+        <w:rPr>
+          <w:rFonts w:ascii="Times New Roman" w:hAnsi="Times New Roman" w:cs="Times New Roman"/>
+          <w:bCs/>
+        </w:rPr>
+        <w:t xml:space="preserve"> three institutional parameters drive most of the framework's residual uncertainty</w:t>
       </w:r>
       <w:r>
         <w:rPr>
@@ -2363,7 +2717,7 @@
           <w:rFonts w:ascii="Times New Roman" w:hAnsi="Times New Roman" w:cs="Times New Roman"/>
           <w:bCs/>
         </w:rPr>
-        <w:t xml:space="preserve"> and QUEUE_OK; the tornado chart (Fig. 3b) confirms that </w:t>
+        <w:t xml:space="preserve"> and </w:t>
       </w:r>
       <w:proofErr w:type="spellStart"/>
       <w:r>
@@ -2371,6 +2725,29 @@
           <w:rFonts w:ascii="Times New Roman" w:hAnsi="Times New Roman" w:cs="Times New Roman"/>
           <w:bCs/>
         </w:rPr>
+        <w:t>QUEUE_</w:t>
+      </w:r>
+      <w:r>
+        <w:rPr>
+          <w:rFonts w:ascii="Times New Roman" w:hAnsi="Times New Roman" w:cs="Times New Roman"/>
+          <w:bCs/>
+        </w:rPr>
+        <w:t>ok</w:t>
+      </w:r>
+      <w:proofErr w:type="spellEnd"/>
+      <w:r>
+        <w:rPr>
+          <w:rFonts w:ascii="Times New Roman" w:hAnsi="Times New Roman" w:cs="Times New Roman"/>
+          <w:bCs/>
+        </w:rPr>
+        <w:t xml:space="preserve">; the tornado chart (Fig. 3b) confirms that </w:t>
+      </w:r>
+      <w:proofErr w:type="spellStart"/>
+      <w:r>
+        <w:rPr>
+          <w:rFonts w:ascii="Times New Roman" w:hAnsi="Times New Roman" w:cs="Times New Roman"/>
+          <w:bCs/>
+        </w:rPr>
         <w:t>DEST_absorb</w:t>
       </w:r>
       <w:proofErr w:type="spellEnd"/>
@@ -2379,7 +2756,7 @@
           <w:rFonts w:ascii="Times New Roman" w:hAnsi="Times New Roman" w:cs="Times New Roman"/>
           <w:bCs/>
         </w:rPr>
-        <w:t xml:space="preserve">, QUEUE_OK, and </w:t>
+        <w:t xml:space="preserve">, </w:t>
       </w:r>
       <w:proofErr w:type="spellStart"/>
       <w:r>
@@ -2387,6 +2764,29 @@
           <w:rFonts w:ascii="Times New Roman" w:hAnsi="Times New Roman" w:cs="Times New Roman"/>
           <w:bCs/>
         </w:rPr>
+        <w:t>QUEUE_</w:t>
+      </w:r>
+      <w:r>
+        <w:rPr>
+          <w:rFonts w:ascii="Times New Roman" w:hAnsi="Times New Roman" w:cs="Times New Roman"/>
+          <w:bCs/>
+        </w:rPr>
+        <w:t>ok</w:t>
+      </w:r>
+      <w:proofErr w:type="spellEnd"/>
+      <w:r>
+        <w:rPr>
+          <w:rFonts w:ascii="Times New Roman" w:hAnsi="Times New Roman" w:cs="Times New Roman"/>
+          <w:bCs/>
+        </w:rPr>
+        <w:t xml:space="preserve">, and </w:t>
+      </w:r>
+      <w:proofErr w:type="spellStart"/>
+      <w:r>
+        <w:rPr>
+          <w:rFonts w:ascii="Times New Roman" w:hAnsi="Times New Roman" w:cs="Times New Roman"/>
+          <w:bCs/>
+        </w:rPr>
         <w:t>MIG_elig</w:t>
       </w:r>
       <w:proofErr w:type="spellEnd"/>
@@ -2418,7 +2818,146 @@
           <w:rFonts w:ascii="Times New Roman" w:hAnsi="Times New Roman" w:cs="Times New Roman"/>
           <w:bCs/>
         </w:rPr>
-        <w:t xml:space="preserve"> The IEA 2025 Energy and AI report and Knittel et al.'s capacity-expansion modeling each independently identify these institutional levers as the binding constraint, arrived at through methodologies distinct from the bottom-up cascade developed here; the cascade complements both by providing endogenous determination of which flexibility levels are physically defensible and by addressing the spatial direction Zhou et al. identified as future work.</w:t>
+        <w:t xml:space="preserve"> The IEA 2025 Energy and AI report </w:t>
+      </w:r>
+      <w:r>
+        <w:rPr>
+          <w:rFonts w:ascii="Times New Roman" w:hAnsi="Times New Roman" w:cs="Times New Roman"/>
+          <w:bCs/>
+        </w:rPr>
+        <w:t xml:space="preserve">explicitly identifies economic, operational, and contractual constraints as requiring better understanding to realize flexibility </w:t>
+      </w:r>
+      <w:proofErr w:type="gramStart"/>
+      <w:r>
+        <w:rPr>
+          <w:rFonts w:ascii="Times New Roman" w:hAnsi="Times New Roman" w:cs="Times New Roman"/>
+          <w:bCs/>
+        </w:rPr>
+        <w:t>potential</w:t>
+      </w:r>
+      <w:r>
+        <w:rPr>
+          <w:rFonts w:ascii="Times New Roman" w:hAnsi="Times New Roman" w:cs="Times New Roman"/>
+          <w:bCs/>
+        </w:rPr>
+        <w:t>[</w:t>
+      </w:r>
+      <w:proofErr w:type="gramEnd"/>
+      <w:r>
+        <w:rPr>
+          <w:rFonts w:ascii="Times New Roman" w:hAnsi="Times New Roman" w:cs="Times New Roman"/>
+          <w:bCs/>
+        </w:rPr>
+        <w:t>4]</w:t>
+      </w:r>
+      <w:r>
+        <w:rPr>
+          <w:rFonts w:ascii="Times New Roman" w:hAnsi="Times New Roman" w:cs="Times New Roman"/>
+          <w:bCs/>
+        </w:rPr>
+        <w:t xml:space="preserve">, </w:t>
+      </w:r>
+      <w:r>
+        <w:rPr>
+          <w:rFonts w:ascii="Times New Roman" w:hAnsi="Times New Roman" w:cs="Times New Roman"/>
+          <w:bCs/>
+        </w:rPr>
+        <w:t>and Knittel et al.'s</w:t>
+      </w:r>
+      <w:r>
+        <w:rPr>
+          <w:rFonts w:ascii="Times New Roman" w:hAnsi="Times New Roman" w:cs="Times New Roman"/>
+          <w:bCs/>
+        </w:rPr>
+        <w:t xml:space="preserve"> </w:t>
+      </w:r>
+      <w:r>
+        <w:rPr>
+          <w:rFonts w:ascii="Times New Roman" w:hAnsi="Times New Roman" w:cs="Times New Roman"/>
+          <w:bCs/>
+        </w:rPr>
+        <w:t xml:space="preserve">capacity-expansion modeling </w:t>
+      </w:r>
+      <w:r>
+        <w:rPr>
+          <w:rFonts w:ascii="Times New Roman" w:hAnsi="Times New Roman" w:cs="Times New Roman"/>
+          <w:bCs/>
+        </w:rPr>
+        <w:t xml:space="preserve">parameterizes flexible-workload share exogenously across a 1-100% range to evaluate system-level </w:t>
+      </w:r>
+      <w:proofErr w:type="gramStart"/>
+      <w:r>
+        <w:rPr>
+          <w:rFonts w:ascii="Times New Roman" w:hAnsi="Times New Roman" w:cs="Times New Roman"/>
+          <w:bCs/>
+        </w:rPr>
+        <w:t>consequences</w:t>
+      </w:r>
+      <w:r>
+        <w:rPr>
+          <w:rFonts w:ascii="Times New Roman" w:hAnsi="Times New Roman" w:cs="Times New Roman"/>
+          <w:bCs/>
+        </w:rPr>
+        <w:t>[</w:t>
+      </w:r>
+      <w:proofErr w:type="gramEnd"/>
+      <w:r>
+        <w:rPr>
+          <w:rFonts w:ascii="Times New Roman" w:hAnsi="Times New Roman" w:cs="Times New Roman"/>
+          <w:bCs/>
+        </w:rPr>
+        <w:t>15]</w:t>
+      </w:r>
+      <w:r>
+        <w:rPr>
+          <w:rFonts w:ascii="Times New Roman" w:hAnsi="Times New Roman" w:cs="Times New Roman"/>
+          <w:bCs/>
+        </w:rPr>
+        <w:t>.</w:t>
+      </w:r>
+      <w:r>
+        <w:rPr>
+          <w:rFonts w:ascii="Times New Roman" w:hAnsi="Times New Roman" w:cs="Times New Roman"/>
+          <w:bCs/>
+        </w:rPr>
+        <w:t xml:space="preserve"> Both motivate the need</w:t>
+      </w:r>
+      <w:r>
+        <w:rPr>
+          <w:rFonts w:ascii="Times New Roman" w:hAnsi="Times New Roman" w:cs="Times New Roman"/>
+          <w:bCs/>
+        </w:rPr>
+        <w:t xml:space="preserve"> </w:t>
+      </w:r>
+      <w:r>
+        <w:rPr>
+          <w:rFonts w:ascii="Times New Roman" w:hAnsi="Times New Roman" w:cs="Times New Roman"/>
+          <w:bCs/>
+        </w:rPr>
+        <w:t xml:space="preserve">for endogenous determination of which flexibility levels are physically and operationally defensible. The bottom-up cascade developed here provides that determination and addresses the spatial direction Zhou et al. identified as future </w:t>
+      </w:r>
+      <w:proofErr w:type="gramStart"/>
+      <w:r>
+        <w:rPr>
+          <w:rFonts w:ascii="Times New Roman" w:hAnsi="Times New Roman" w:cs="Times New Roman"/>
+          <w:bCs/>
+        </w:rPr>
+        <w:t>work[</w:t>
+      </w:r>
+      <w:proofErr w:type="gramEnd"/>
+      <w:r>
+        <w:rPr>
+          <w:rFonts w:ascii="Times New Roman" w:hAnsi="Times New Roman" w:cs="Times New Roman"/>
+          <w:bCs/>
+        </w:rPr>
+        <w:t>10]</w:t>
+      </w:r>
+      <w:r>
+        <w:rPr>
+          <w:rFonts w:ascii="Times New Roman" w:hAnsi="Times New Roman" w:cs="Times New Roman"/>
+          <w:bCs/>
+        </w:rPr>
+        <w:t>.</w:t>
       </w:r>
     </w:p>
     <w:tbl>
@@ -2521,7 +3060,18 @@
             </w:r>
             <w:proofErr w:type="gramEnd"/>
             <w:r>
-              <w:t>0.15, 0.55]) and QUEUE_OK (</w:t>
+              <w:t xml:space="preserve">0.15, 0.55]) and </w:t>
+            </w:r>
+            <w:proofErr w:type="spellStart"/>
+            <w:r>
+              <w:t>QUEUE_</w:t>
+            </w:r>
+            <w:r>
+              <w:t>ok</w:t>
+            </w:r>
+            <w:proofErr w:type="spellEnd"/>
+            <w:r>
+              <w:t xml:space="preserve"> (</w:t>
             </w:r>
             <w:proofErr w:type="gramStart"/>
             <w:r>
@@ -2545,7 +3095,18 @@
             </w:r>
             <w:proofErr w:type="spellEnd"/>
             <w:r>
-              <w:t xml:space="preserve"> = 0.30, QUEUE_OK = 0.85).</w:t>
+              <w:t xml:space="preserve"> = 0.30, </w:t>
+            </w:r>
+            <w:proofErr w:type="spellStart"/>
+            <w:r>
+              <w:t>QUEUE_</w:t>
+            </w:r>
+            <w:r>
+              <w:t>ok</w:t>
+            </w:r>
+            <w:proofErr w:type="spellEnd"/>
+            <w:r>
+              <w:t xml:space="preserve"> = 0.85).</w:t>
             </w:r>
           </w:p>
         </w:tc>
@@ -2621,10 +3182,21 @@
             </w:r>
             <w:proofErr w:type="spellEnd"/>
             <w:r>
-              <w:t xml:space="preserve">, QUEUE_OK, and </w:t>
+              <w:t xml:space="preserve">, </w:t>
             </w:r>
             <w:proofErr w:type="spellStart"/>
             <w:r>
+              <w:t>QUEUE_</w:t>
+            </w:r>
+            <w:r>
+              <w:t>ok</w:t>
+            </w:r>
+            <w:proofErr w:type="spellEnd"/>
+            <w:r>
+              <w:t xml:space="preserve">, and </w:t>
+            </w:r>
+            <w:proofErr w:type="spellStart"/>
+            <w:r>
               <w:t>MIG_elig</w:t>
             </w:r>
             <w:proofErr w:type="spellEnd"/>
@@ -2645,7 +3217,18 @@
             </w:r>
             <w:proofErr w:type="spellEnd"/>
             <w:r>
-              <w:t xml:space="preserve">, NET_OK, </w:t>
+              <w:t xml:space="preserve">, </w:t>
+            </w:r>
+            <w:proofErr w:type="spellStart"/>
+            <w:r>
+              <w:t>NET_</w:t>
+            </w:r>
+            <w:r>
+              <w:t>ok</w:t>
+            </w:r>
+            <w:proofErr w:type="spellEnd"/>
+            <w:r>
+              <w:t xml:space="preserve">, </w:t>
             </w:r>
             <w:proofErr w:type="spellStart"/>
             <w:r>
@@ -2736,14 +3319,51 @@
           <w:rFonts w:ascii="Times New Roman" w:hAnsi="Times New Roman" w:cs="Times New Roman"/>
           <w:bCs/>
         </w:rPr>
-        <w:t>, following a demonstration with Omaha Public Power District in which Google reduced ML workload power demand during three grid stress events.</w:t>
-      </w:r>
-      <w:r>
-        <w:rPr>
-          <w:rFonts w:ascii="Times New Roman" w:hAnsi="Times New Roman" w:cs="Times New Roman"/>
-          <w:bCs/>
-        </w:rPr>
-        <w:t>[14]</w:t>
+        <w:t xml:space="preserve">, following a demonstration with Omaha Public Power District in which Google reduced ML workload power demand during three grid stress </w:t>
+      </w:r>
+      <w:proofErr w:type="gramStart"/>
+      <w:r>
+        <w:rPr>
+          <w:rFonts w:ascii="Times New Roman" w:hAnsi="Times New Roman" w:cs="Times New Roman"/>
+          <w:bCs/>
+        </w:rPr>
+        <w:t>events</w:t>
+      </w:r>
+      <w:r>
+        <w:rPr>
+          <w:rFonts w:ascii="Times New Roman" w:hAnsi="Times New Roman" w:cs="Times New Roman"/>
+          <w:bCs/>
+        </w:rPr>
+        <w:t>[</w:t>
+      </w:r>
+      <w:proofErr w:type="gramEnd"/>
+      <w:r>
+        <w:rPr>
+          <w:rFonts w:ascii="Times New Roman" w:hAnsi="Times New Roman" w:cs="Times New Roman"/>
+          <w:bCs/>
+        </w:rPr>
+        <w:t>1</w:t>
+      </w:r>
+      <w:r>
+        <w:rPr>
+          <w:rFonts w:ascii="Times New Roman" w:hAnsi="Times New Roman" w:cs="Times New Roman"/>
+          <w:bCs/>
+        </w:rPr>
+        <w:t>6</w:t>
+      </w:r>
+      <w:r>
+        <w:rPr>
+          <w:rFonts w:ascii="Times New Roman" w:hAnsi="Times New Roman" w:cs="Times New Roman"/>
+          <w:bCs/>
+        </w:rPr>
+        <w:t>]</w:t>
+      </w:r>
+      <w:r>
+        <w:rPr>
+          <w:rFonts w:ascii="Times New Roman" w:hAnsi="Times New Roman" w:cs="Times New Roman"/>
+          <w:bCs/>
+        </w:rPr>
+        <w:t>.</w:t>
       </w:r>
       <w:r>
         <w:rPr>
@@ -2873,20 +3493,6 @@
         </w:rPr>
         <w:t xml:space="preserve"> these results. </w:t>
       </w:r>
-      <w:r>
-        <w:rPr>
-          <w:rFonts w:ascii="Times New Roman" w:hAnsi="Times New Roman" w:cs="Times New Roman"/>
-          <w:bCs/>
-        </w:rPr>
-        <w:t>D</w:t>
-      </w:r>
-      <w:r>
-        <w:rPr>
-          <w:rFonts w:ascii="Times New Roman" w:hAnsi="Times New Roman" w:cs="Times New Roman"/>
-          <w:bCs/>
-        </w:rPr>
-        <w:t>estination compute absorption (</w:t>
-      </w:r>
       <w:proofErr w:type="spellStart"/>
       <w:r>
         <w:rPr>
@@ -2901,7 +3507,14 @@
           <w:rFonts w:ascii="Times New Roman" w:hAnsi="Times New Roman" w:cs="Times New Roman"/>
           <w:bCs/>
         </w:rPr>
-        <w:t>), the unpinned fraction of migration eligibility (</w:t>
+        <w:t>,</w:t>
+      </w:r>
+      <w:r>
+        <w:rPr>
+          <w:rFonts w:ascii="Times New Roman" w:hAnsi="Times New Roman" w:cs="Times New Roman"/>
+          <w:bCs/>
+        </w:rPr>
+        <w:t xml:space="preserve"> </w:t>
       </w:r>
       <w:proofErr w:type="spellStart"/>
       <w:r>
@@ -2917,7 +3530,30 @@
           <w:rFonts w:ascii="Times New Roman" w:hAnsi="Times New Roman" w:cs="Times New Roman"/>
           <w:bCs/>
         </w:rPr>
-        <w:t xml:space="preserve"> Component B), and post-stress queue absorption at fleet scale (QUEUE_OK) </w:t>
+        <w:t xml:space="preserve"> Component B, and </w:t>
+      </w:r>
+      <w:proofErr w:type="spellStart"/>
+      <w:r>
+        <w:rPr>
+          <w:rFonts w:ascii="Times New Roman" w:hAnsi="Times New Roman" w:cs="Times New Roman"/>
+          <w:bCs/>
+        </w:rPr>
+        <w:t>QUEUE_</w:t>
+      </w:r>
+      <w:r>
+        <w:rPr>
+          <w:rFonts w:ascii="Times New Roman" w:hAnsi="Times New Roman" w:cs="Times New Roman"/>
+          <w:bCs/>
+        </w:rPr>
+        <w:t>ok</w:t>
+      </w:r>
+      <w:proofErr w:type="spellEnd"/>
+      <w:r>
+        <w:rPr>
+          <w:rFonts w:ascii="Times New Roman" w:hAnsi="Times New Roman" w:cs="Times New Roman"/>
+          <w:bCs/>
+        </w:rPr>
+        <w:t xml:space="preserve"> </w:t>
       </w:r>
       <w:r>
         <w:rPr>
@@ -3031,21 +3667,31 @@
         <w:rPr>
           <w:rFonts w:ascii="Times New Roman" w:eastAsia="Calibri" w:hAnsi="Times New Roman" w:cs="Times New Roman"/>
         </w:rPr>
-        <w:t xml:space="preserve">The framework decomposes accreditable system slack — the fraction of nameplate inference load simultaneously flexible, operationally committable, and capacity-accreditable during a grid dispatch event — into three composable mechanisms (spatial migration, temporal deferral of non-interactive workloads, and DVFS on residual compute), each itself a small mini-cascade of multiplicatively-composed parameters representing the conditions that must hold for one MW of that mechanism's contribution to realize. The three </w:t>
-      </w:r>
-      <w:proofErr w:type="gramStart"/>
+        <w:t xml:space="preserve">The framework decomposes accreditable system slack — the fraction of nameplate inference load simultaneously flexible, operationally committable, and capacity-accreditable during a grid dispatch event — into three composable mechanisms (spatial migration, temporal deferral of non-interactive workloads, and DVFS on residual compute), each itself a small </w:t>
+      </w:r>
       <w:r>
         <w:rPr>
           <w:rFonts w:ascii="Times New Roman" w:eastAsia="Calibri" w:hAnsi="Times New Roman" w:cs="Times New Roman"/>
         </w:rPr>
-        <w:t>mini-cascades</w:t>
-      </w:r>
-      <w:proofErr w:type="gramEnd"/>
+        <w:t>sub</w:t>
+      </w:r>
       <w:r>
         <w:rPr>
           <w:rFonts w:ascii="Times New Roman" w:eastAsia="Calibri" w:hAnsi="Times New Roman" w:cs="Times New Roman"/>
         </w:rPr>
-        <w:t xml:space="preserve"> compose additively at the megawatt layer with sequential ordering </w:t>
+        <w:t xml:space="preserve">-cascade of multiplicatively-composed parameters representing the conditions that must hold for one MW of that mechanism's contribution to realize. The three </w:t>
+      </w:r>
+      <w:r>
+        <w:rPr>
+          <w:rFonts w:ascii="Times New Roman" w:eastAsia="Calibri" w:hAnsi="Times New Roman" w:cs="Times New Roman"/>
+        </w:rPr>
+        <w:t>sub</w:t>
+      </w:r>
+      <w:r>
+        <w:rPr>
+          <w:rFonts w:ascii="Times New Roman" w:eastAsia="Calibri" w:hAnsi="Times New Roman" w:cs="Times New Roman"/>
+        </w:rPr>
+        <w:t xml:space="preserve">-cascades compose additively at the megawatt layer with sequential ordering </w:t>
       </w:r>
       <w:r>
         <w:rPr>
@@ -3093,7 +3739,19 @@
         <w:rPr>
           <w:rFonts w:ascii="Times New Roman" w:eastAsia="Calibri" w:hAnsi="Times New Roman" w:cs="Times New Roman"/>
         </w:rPr>
-        <w:t xml:space="preserve"> = 0.43, McKinsey December 2025) and an inference-dominant facility (</w:t>
+        <w:t xml:space="preserve"> = 0.43, McKinsey December 2025</w:t>
+      </w:r>
+      <w:r>
+        <w:rPr>
+          <w:rFonts w:ascii="Times New Roman" w:eastAsia="Calibri" w:hAnsi="Times New Roman" w:cs="Times New Roman"/>
+        </w:rPr>
+        <w:t>[9]</w:t>
+      </w:r>
+      <w:r>
+        <w:rPr>
+          <w:rFonts w:ascii="Times New Roman" w:eastAsia="Calibri" w:hAnsi="Times New Roman" w:cs="Times New Roman"/>
+        </w:rPr>
+        <w:t>) and an inference-dominant facility (</w:t>
       </w:r>
       <w:proofErr w:type="spellStart"/>
       <w:r>
@@ -3115,7 +3773,31 @@
         <w:rPr>
           <w:rFonts w:ascii="Times New Roman" w:eastAsia="Calibri" w:hAnsi="Times New Roman" w:cs="Times New Roman"/>
         </w:rPr>
-        <w:t xml:space="preserve"> = 0.70, anchored in IEA 2025 and Zhou et al. 2024).</w:t>
+        <w:t xml:space="preserve"> = 0.70, anchored in IEA 2025</w:t>
+      </w:r>
+      <w:r>
+        <w:rPr>
+          <w:rFonts w:ascii="Times New Roman" w:eastAsia="Calibri" w:hAnsi="Times New Roman" w:cs="Times New Roman"/>
+        </w:rPr>
+        <w:t>[4]</w:t>
+      </w:r>
+      <w:r>
+        <w:rPr>
+          <w:rFonts w:ascii="Times New Roman" w:eastAsia="Calibri" w:hAnsi="Times New Roman" w:cs="Times New Roman"/>
+        </w:rPr>
+        <w:t xml:space="preserve"> and Zhou et al. 2024</w:t>
+      </w:r>
+      <w:r>
+        <w:rPr>
+          <w:rFonts w:ascii="Times New Roman" w:eastAsia="Calibri" w:hAnsi="Times New Roman" w:cs="Times New Roman"/>
+        </w:rPr>
+        <w:t>[10]</w:t>
+      </w:r>
+      <w:r>
+        <w:rPr>
+          <w:rFonts w:ascii="Times New Roman" w:eastAsia="Calibri" w:hAnsi="Times New Roman" w:cs="Times New Roman"/>
+        </w:rPr>
+        <w:t>).</w:t>
       </w:r>
     </w:p>
     <w:p>
@@ -3162,7 +3844,43 @@
         <w:rPr>
           <w:rFonts w:ascii="Times New Roman" w:eastAsia="Calibri" w:hAnsi="Times New Roman" w:cs="Times New Roman"/>
         </w:rPr>
-        <w:t xml:space="preserve">Specifications for all eleven framework parameters are reported in Table M1, organized into four groups: scope scalar (1 parameter), spatial mini-cascade (6 parameters), deferral mini-cascade (3 parameters), and DVFS mini-cascade (2 parameters). </w:t>
+        <w:t xml:space="preserve">Specifications for all eleven framework parameters are reported in Table M1, organized into four groups: scope scalar (1 parameter), spatial </w:t>
+      </w:r>
+      <w:r>
+        <w:rPr>
+          <w:rFonts w:ascii="Times New Roman" w:eastAsia="Calibri" w:hAnsi="Times New Roman" w:cs="Times New Roman"/>
+        </w:rPr>
+        <w:t>sub</w:t>
+      </w:r>
+      <w:r>
+        <w:rPr>
+          <w:rFonts w:ascii="Times New Roman" w:eastAsia="Calibri" w:hAnsi="Times New Roman" w:cs="Times New Roman"/>
+        </w:rPr>
+        <w:t xml:space="preserve">-cascade (6 parameters), deferral </w:t>
+      </w:r>
+      <w:r>
+        <w:rPr>
+          <w:rFonts w:ascii="Times New Roman" w:eastAsia="Calibri" w:hAnsi="Times New Roman" w:cs="Times New Roman"/>
+        </w:rPr>
+        <w:t>sub</w:t>
+      </w:r>
+      <w:r>
+        <w:rPr>
+          <w:rFonts w:ascii="Times New Roman" w:eastAsia="Calibri" w:hAnsi="Times New Roman" w:cs="Times New Roman"/>
+        </w:rPr>
+        <w:t xml:space="preserve">-cascade (3 parameters), and DVFS </w:t>
+      </w:r>
+      <w:r>
+        <w:rPr>
+          <w:rFonts w:ascii="Times New Roman" w:eastAsia="Calibri" w:hAnsi="Times New Roman" w:cs="Times New Roman"/>
+        </w:rPr>
+        <w:t>sub</w:t>
+      </w:r>
+      <w:r>
+        <w:rPr>
+          <w:rFonts w:ascii="Times New Roman" w:eastAsia="Calibri" w:hAnsi="Times New Roman" w:cs="Times New Roman"/>
+        </w:rPr>
+        <w:t xml:space="preserve">-cascade (2 parameters). </w:t>
       </w:r>
     </w:p>
     <w:p>
@@ -3206,8 +3924,8 @@
         <w:gridCol w:w="1075"/>
         <w:gridCol w:w="936"/>
         <w:gridCol w:w="1404"/>
-        <w:gridCol w:w="810"/>
-        <w:gridCol w:w="1980"/>
+        <w:gridCol w:w="900"/>
+        <w:gridCol w:w="1890"/>
         <w:gridCol w:w="4066"/>
         <w:gridCol w:w="2919"/>
       </w:tblGrid>
@@ -3328,7 +4046,7 @@
         </w:tc>
         <w:tc>
           <w:tcPr>
-            <w:tcW w:w="810" w:type="dxa"/>
+            <w:tcW w:w="900" w:type="dxa"/>
             <w:tcBorders>
               <w:top w:val="single" w:sz="4" w:space="0" w:color="666666"/>
               <w:left w:val="single" w:sz="4" w:space="0" w:color="666666"/>
@@ -3366,7 +4084,7 @@
         </w:tc>
         <w:tc>
           <w:tcPr>
-            <w:tcW w:w="1980" w:type="dxa"/>
+            <w:tcW w:w="1890" w:type="dxa"/>
             <w:tcBorders>
               <w:top w:val="single" w:sz="4" w:space="0" w:color="666666"/>
               <w:left w:val="single" w:sz="4" w:space="0" w:color="666666"/>
@@ -3590,7 +4308,7 @@
         </w:tc>
         <w:tc>
           <w:tcPr>
-            <w:tcW w:w="810" w:type="dxa"/>
+            <w:tcW w:w="900" w:type="dxa"/>
             <w:tcBorders>
               <w:top w:val="single" w:sz="4" w:space="0" w:color="666666"/>
               <w:left w:val="single" w:sz="4" w:space="0" w:color="666666"/>
@@ -3632,7 +4350,7 @@
         </w:tc>
         <w:tc>
           <w:tcPr>
-            <w:tcW w:w="1980" w:type="dxa"/>
+            <w:tcW w:w="1890" w:type="dxa"/>
             <w:tcBorders>
               <w:top w:val="single" w:sz="4" w:space="0" w:color="666666"/>
               <w:left w:val="single" w:sz="4" w:space="0" w:color="666666"/>
@@ -3889,7 +4607,7 @@
         </w:tc>
         <w:tc>
           <w:tcPr>
-            <w:tcW w:w="810" w:type="dxa"/>
+            <w:tcW w:w="900" w:type="dxa"/>
             <w:tcBorders>
               <w:top w:val="single" w:sz="4" w:space="0" w:color="666666"/>
               <w:left w:val="single" w:sz="4" w:space="0" w:color="666666"/>
@@ -3923,7 +4641,7 @@
         </w:tc>
         <w:tc>
           <w:tcPr>
-            <w:tcW w:w="1980" w:type="dxa"/>
+            <w:tcW w:w="1890" w:type="dxa"/>
             <w:tcBorders>
               <w:top w:val="single" w:sz="4" w:space="0" w:color="666666"/>
               <w:left w:val="single" w:sz="4" w:space="0" w:color="666666"/>
@@ -4212,7 +4930,7 @@
         </w:tc>
         <w:tc>
           <w:tcPr>
-            <w:tcW w:w="810" w:type="dxa"/>
+            <w:tcW w:w="900" w:type="dxa"/>
             <w:tcBorders>
               <w:top w:val="single" w:sz="4" w:space="0" w:color="666666"/>
               <w:left w:val="single" w:sz="4" w:space="0" w:color="666666"/>
@@ -4254,7 +4972,7 @@
         </w:tc>
         <w:tc>
           <w:tcPr>
-            <w:tcW w:w="1980" w:type="dxa"/>
+            <w:tcW w:w="1890" w:type="dxa"/>
             <w:tcBorders>
               <w:top w:val="single" w:sz="4" w:space="0" w:color="666666"/>
               <w:left w:val="single" w:sz="4" w:space="0" w:color="666666"/>
@@ -4472,7 +5190,23 @@
                 <w:sz w:val="16"/>
                 <w:szCs w:val="16"/>
               </w:rPr>
-              <w:t>15]</w:t>
+              <w:t>1</w:t>
+            </w:r>
+            <w:r>
+              <w:rPr>
+                <w:rFonts w:ascii="Times New Roman" w:eastAsia="Calibri" w:hAnsi="Times New Roman" w:cs="Times New Roman"/>
+                <w:sz w:val="16"/>
+                <w:szCs w:val="16"/>
+              </w:rPr>
+              <w:t>7</w:t>
+            </w:r>
+            <w:r>
+              <w:rPr>
+                <w:rFonts w:ascii="Times New Roman" w:eastAsia="Calibri" w:hAnsi="Times New Roman" w:cs="Times New Roman"/>
+                <w:sz w:val="16"/>
+                <w:szCs w:val="16"/>
+              </w:rPr>
+              <w:t>]</w:t>
             </w:r>
             <w:r>
               <w:rPr>
@@ -4514,7 +5248,7 @@
                 <w:sz w:val="16"/>
                 <w:szCs w:val="16"/>
               </w:rPr>
-              <w:t>6</w:t>
+              <w:t>8</w:t>
             </w:r>
             <w:r>
               <w:rPr>
@@ -4564,7 +5298,7 @@
                 <w:sz w:val="16"/>
                 <w:szCs w:val="16"/>
               </w:rPr>
-              <w:t>7</w:t>
+              <w:t>9</w:t>
             </w:r>
             <w:r>
               <w:rPr>
@@ -4678,7 +5412,7 @@
         </w:tc>
         <w:tc>
           <w:tcPr>
-            <w:tcW w:w="810" w:type="dxa"/>
+            <w:tcW w:w="900" w:type="dxa"/>
             <w:tcBorders>
               <w:top w:val="single" w:sz="4" w:space="0" w:color="666666"/>
               <w:left w:val="single" w:sz="4" w:space="0" w:color="666666"/>
@@ -4720,7 +5454,7 @@
         </w:tc>
         <w:tc>
           <w:tcPr>
-            <w:tcW w:w="1980" w:type="dxa"/>
+            <w:tcW w:w="1890" w:type="dxa"/>
             <w:tcBorders>
               <w:top w:val="single" w:sz="4" w:space="0" w:color="666666"/>
               <w:left w:val="single" w:sz="4" w:space="0" w:color="666666"/>
@@ -4942,7 +5676,7 @@
         </w:tc>
         <w:tc>
           <w:tcPr>
-            <w:tcW w:w="810" w:type="dxa"/>
+            <w:tcW w:w="900" w:type="dxa"/>
             <w:tcBorders>
               <w:top w:val="single" w:sz="4" w:space="0" w:color="666666"/>
               <w:left w:val="single" w:sz="4" w:space="0" w:color="666666"/>
@@ -4976,7 +5710,7 @@
         </w:tc>
         <w:tc>
           <w:tcPr>
-            <w:tcW w:w="1980" w:type="dxa"/>
+            <w:tcW w:w="1890" w:type="dxa"/>
             <w:tcBorders>
               <w:top w:val="single" w:sz="4" w:space="0" w:color="666666"/>
               <w:left w:val="single" w:sz="4" w:space="0" w:color="666666"/>
@@ -5215,7 +5949,7 @@
         </w:tc>
         <w:tc>
           <w:tcPr>
-            <w:tcW w:w="810" w:type="dxa"/>
+            <w:tcW w:w="900" w:type="dxa"/>
             <w:tcBorders>
               <w:top w:val="single" w:sz="4" w:space="0" w:color="666666"/>
               <w:left w:val="single" w:sz="4" w:space="0" w:color="666666"/>
@@ -5249,7 +5983,7 @@
         </w:tc>
         <w:tc>
           <w:tcPr>
-            <w:tcW w:w="1980" w:type="dxa"/>
+            <w:tcW w:w="1890" w:type="dxa"/>
             <w:tcBorders>
               <w:top w:val="single" w:sz="4" w:space="0" w:color="666666"/>
               <w:left w:val="single" w:sz="4" w:space="0" w:color="666666"/>
@@ -5322,7 +6056,23 @@
                 <w:sz w:val="16"/>
                 <w:szCs w:val="16"/>
               </w:rPr>
-              <w:t>Headroom × hardware compatibility × pre-staging; literature dispute on utilization (LBNL 40%, IEA 90%, Knittel 80%, Zhou 70-80%, Guidi 75%, Uptime &lt;40%)</w:t>
+              <w:t>Headroom × hardware compatibility × pre-staging; literature dispute on utilization (LBNL 40%, IEA 90%, Knittel 80%, Zhou 8</w:t>
+            </w:r>
+            <w:r>
+              <w:rPr>
+                <w:rFonts w:ascii="Times New Roman" w:eastAsia="Calibri" w:hAnsi="Times New Roman" w:cs="Times New Roman"/>
+                <w:sz w:val="16"/>
+                <w:szCs w:val="16"/>
+              </w:rPr>
+              <w:t>1</w:t>
+            </w:r>
+            <w:r>
+              <w:rPr>
+                <w:rFonts w:ascii="Times New Roman" w:eastAsia="Calibri" w:hAnsi="Times New Roman" w:cs="Times New Roman"/>
+                <w:sz w:val="16"/>
+                <w:szCs w:val="16"/>
+              </w:rPr>
+              <w:t>%, Guidi 75%, Uptime &lt;40%)</w:t>
             </w:r>
           </w:p>
         </w:tc>
@@ -5493,7 +6243,7 @@
                 <w:sz w:val="16"/>
                 <w:szCs w:val="16"/>
               </w:rPr>
-              <w:t>8</w:t>
+              <w:t>5</w:t>
             </w:r>
             <w:r>
               <w:rPr>
@@ -5535,7 +6285,7 @@
                 <w:sz w:val="16"/>
                 <w:szCs w:val="16"/>
               </w:rPr>
-              <w:t>19</w:t>
+              <w:t>20</w:t>
             </w:r>
             <w:r>
               <w:rPr>
@@ -5595,7 +6345,15 @@
                 <w:sz w:val="16"/>
                 <w:szCs w:val="16"/>
               </w:rPr>
-              <w:t>20</w:t>
+              <w:t>2</w:t>
+            </w:r>
+            <w:r>
+              <w:rPr>
+                <w:rFonts w:ascii="Times New Roman" w:eastAsia="Calibri" w:hAnsi="Times New Roman" w:cs="Times New Roman"/>
+                <w:sz w:val="16"/>
+                <w:szCs w:val="16"/>
+              </w:rPr>
+              <w:t>1</w:t>
             </w:r>
             <w:r>
               <w:rPr>
@@ -5709,7 +6467,7 @@
         </w:tc>
         <w:tc>
           <w:tcPr>
-            <w:tcW w:w="810" w:type="dxa"/>
+            <w:tcW w:w="900" w:type="dxa"/>
             <w:tcBorders>
               <w:top w:val="single" w:sz="4" w:space="0" w:color="666666"/>
               <w:left w:val="single" w:sz="4" w:space="0" w:color="666666"/>
@@ -5751,7 +6509,7 @@
         </w:tc>
         <w:tc>
           <w:tcPr>
-            <w:tcW w:w="1980" w:type="dxa"/>
+            <w:tcW w:w="1890" w:type="dxa"/>
             <w:tcBorders>
               <w:top w:val="single" w:sz="4" w:space="0" w:color="666666"/>
               <w:left w:val="single" w:sz="4" w:space="0" w:color="666666"/>
@@ -5954,7 +6712,7 @@
                 <w:sz w:val="16"/>
                 <w:szCs w:val="16"/>
               </w:rPr>
-              <w:t>1</w:t>
+              <w:t>2</w:t>
             </w:r>
             <w:r>
               <w:rPr>
@@ -6004,7 +6762,7 @@
                 <w:sz w:val="16"/>
                 <w:szCs w:val="16"/>
               </w:rPr>
-              <w:t>2</w:t>
+              <w:t>3</w:t>
             </w:r>
             <w:r>
               <w:rPr>
@@ -6118,7 +6876,7 @@
         </w:tc>
         <w:tc>
           <w:tcPr>
-            <w:tcW w:w="810" w:type="dxa"/>
+            <w:tcW w:w="900" w:type="dxa"/>
             <w:tcBorders>
               <w:top w:val="single" w:sz="4" w:space="0" w:color="666666"/>
               <w:left w:val="single" w:sz="4" w:space="0" w:color="666666"/>
@@ -6160,7 +6918,7 @@
         </w:tc>
         <w:tc>
           <w:tcPr>
-            <w:tcW w:w="1980" w:type="dxa"/>
+            <w:tcW w:w="1890" w:type="dxa"/>
             <w:tcBorders>
               <w:top w:val="single" w:sz="4" w:space="0" w:color="666666"/>
               <w:left w:val="single" w:sz="4" w:space="0" w:color="666666"/>
@@ -6387,7 +7145,7 @@
                 <w:sz w:val="16"/>
                 <w:szCs w:val="16"/>
               </w:rPr>
-              <w:t>3</w:t>
+              <w:t>4</w:t>
             </w:r>
             <w:r>
               <w:rPr>
@@ -6471,7 +7229,7 @@
                 <w:sz w:val="16"/>
                 <w:szCs w:val="16"/>
               </w:rPr>
-              <w:t>4</w:t>
+              <w:t>5</w:t>
             </w:r>
             <w:r>
               <w:rPr>
@@ -6604,7 +7362,7 @@
         </w:tc>
         <w:tc>
           <w:tcPr>
-            <w:tcW w:w="810" w:type="dxa"/>
+            <w:tcW w:w="900" w:type="dxa"/>
             <w:tcBorders>
               <w:top w:val="single" w:sz="4" w:space="0" w:color="666666"/>
               <w:left w:val="single" w:sz="4" w:space="0" w:color="666666"/>
@@ -6646,7 +7404,7 @@
         </w:tc>
         <w:tc>
           <w:tcPr>
-            <w:tcW w:w="1980" w:type="dxa"/>
+            <w:tcW w:w="1890" w:type="dxa"/>
             <w:tcBorders>
               <w:top w:val="single" w:sz="4" w:space="0" w:color="666666"/>
               <w:left w:val="single" w:sz="4" w:space="0" w:color="666666"/>
@@ -6882,7 +7640,15 @@
                 <w:sz w:val="16"/>
                 <w:szCs w:val="16"/>
               </w:rPr>
-              <w:t>25</w:t>
+              <w:t>2</w:t>
+            </w:r>
+            <w:r>
+              <w:rPr>
+                <w:rFonts w:ascii="Times New Roman" w:hAnsi="Times New Roman" w:cs="Times New Roman"/>
+                <w:sz w:val="16"/>
+                <w:szCs w:val="16"/>
+              </w:rPr>
+              <w:t>6</w:t>
             </w:r>
             <w:r>
               <w:rPr>
@@ -6996,7 +7762,7 @@
         </w:tc>
         <w:tc>
           <w:tcPr>
-            <w:tcW w:w="810" w:type="dxa"/>
+            <w:tcW w:w="900" w:type="dxa"/>
             <w:tcBorders>
               <w:top w:val="single" w:sz="4" w:space="0" w:color="666666"/>
               <w:left w:val="single" w:sz="4" w:space="0" w:color="666666"/>
@@ -7030,7 +7796,7 @@
         </w:tc>
         <w:tc>
           <w:tcPr>
-            <w:tcW w:w="1980" w:type="dxa"/>
+            <w:tcW w:w="1890" w:type="dxa"/>
             <w:tcBorders>
               <w:top w:val="single" w:sz="4" w:space="0" w:color="666666"/>
               <w:left w:val="single" w:sz="4" w:space="0" w:color="666666"/>
@@ -7165,7 +7931,15 @@
                 <w:sz w:val="16"/>
                 <w:szCs w:val="16"/>
               </w:rPr>
-              <w:t>25</w:t>
+              <w:t>2</w:t>
+            </w:r>
+            <w:r>
+              <w:rPr>
+                <w:rFonts w:ascii="Times New Roman" w:eastAsia="Calibri" w:hAnsi="Times New Roman" w:cs="Times New Roman"/>
+                <w:sz w:val="16"/>
+                <w:szCs w:val="16"/>
+              </w:rPr>
+              <w:t>6</w:t>
             </w:r>
             <w:r>
               <w:rPr>
@@ -7215,7 +7989,7 @@
                 <w:sz w:val="16"/>
                 <w:szCs w:val="16"/>
               </w:rPr>
-              <w:t>4</w:t>
+              <w:t>5</w:t>
             </w:r>
             <w:r>
               <w:rPr>
@@ -7329,7 +8103,7 @@
         </w:tc>
         <w:tc>
           <w:tcPr>
-            <w:tcW w:w="810" w:type="dxa"/>
+            <w:tcW w:w="900" w:type="dxa"/>
             <w:tcBorders>
               <w:top w:val="single" w:sz="4" w:space="0" w:color="666666"/>
               <w:left w:val="single" w:sz="4" w:space="0" w:color="666666"/>
@@ -7371,7 +8145,7 @@
         </w:tc>
         <w:tc>
           <w:tcPr>
-            <w:tcW w:w="1980" w:type="dxa"/>
+            <w:tcW w:w="1890" w:type="dxa"/>
             <w:tcBorders>
               <w:top w:val="single" w:sz="4" w:space="0" w:color="666666"/>
               <w:left w:val="single" w:sz="4" w:space="0" w:color="666666"/>
@@ -7630,7 +8404,7 @@
         </w:tc>
         <w:tc>
           <w:tcPr>
-            <w:tcW w:w="810" w:type="dxa"/>
+            <w:tcW w:w="900" w:type="dxa"/>
             <w:tcBorders>
               <w:top w:val="single" w:sz="4" w:space="0" w:color="666666"/>
               <w:left w:val="single" w:sz="4" w:space="0" w:color="666666"/>
@@ -7664,7 +8438,7 @@
         </w:tc>
         <w:tc>
           <w:tcPr>
-            <w:tcW w:w="1980" w:type="dxa"/>
+            <w:tcW w:w="1890" w:type="dxa"/>
             <w:tcBorders>
               <w:top w:val="single" w:sz="4" w:space="0" w:color="666666"/>
               <w:left w:val="single" w:sz="4" w:space="0" w:color="666666"/>
@@ -7855,7 +8629,15 @@
                 <w:sz w:val="16"/>
                 <w:szCs w:val="16"/>
               </w:rPr>
-              <w:t>26</w:t>
+              <w:t>2</w:t>
+            </w:r>
+            <w:r>
+              <w:rPr>
+                <w:rFonts w:ascii="Times New Roman" w:eastAsia="Calibri" w:hAnsi="Times New Roman" w:cs="Times New Roman"/>
+                <w:sz w:val="16"/>
+                <w:szCs w:val="16"/>
+              </w:rPr>
+              <w:t>7</w:t>
             </w:r>
             <w:r>
               <w:rPr>
@@ -7905,7 +8687,7 @@
                 <w:sz w:val="16"/>
                 <w:szCs w:val="16"/>
               </w:rPr>
-              <w:t>3</w:t>
+              <w:t>4</w:t>
             </w:r>
             <w:r>
               <w:rPr>
@@ -7973,7 +8755,7 @@
                 <w:sz w:val="16"/>
                 <w:szCs w:val="16"/>
               </w:rPr>
-              <w:t>7</w:t>
+              <w:t>8</w:t>
             </w:r>
             <w:r>
               <w:rPr>
@@ -8095,7 +8877,7 @@
         </w:tc>
         <w:tc>
           <w:tcPr>
-            <w:tcW w:w="810" w:type="dxa"/>
+            <w:tcW w:w="900" w:type="dxa"/>
             <w:tcBorders>
               <w:top w:val="single" w:sz="4" w:space="0" w:color="666666"/>
               <w:left w:val="single" w:sz="4" w:space="0" w:color="666666"/>
@@ -8129,7 +8911,7 @@
         </w:tc>
         <w:tc>
           <w:tcPr>
-            <w:tcW w:w="1980" w:type="dxa"/>
+            <w:tcW w:w="1890" w:type="dxa"/>
             <w:tcBorders>
               <w:top w:val="single" w:sz="4" w:space="0" w:color="666666"/>
               <w:left w:val="single" w:sz="4" w:space="0" w:color="666666"/>
@@ -8386,21 +9168,19 @@
         </w:rPr>
         <w:t xml:space="preserve">The three </w:t>
       </w:r>
-      <w:proofErr w:type="gramStart"/>
-      <w:r>
-        <w:rPr>
-          <w:rFonts w:ascii="Times New Roman" w:hAnsi="Times New Roman" w:cs="Times New Roman"/>
-          <w:bCs/>
-        </w:rPr>
-        <w:t>mini-cascades</w:t>
-      </w:r>
-      <w:proofErr w:type="gramEnd"/>
-      <w:r>
-        <w:rPr>
-          <w:rFonts w:ascii="Times New Roman" w:hAnsi="Times New Roman" w:cs="Times New Roman"/>
-          <w:bCs/>
-        </w:rPr>
-        <w:t xml:space="preserve"> compose multiplicatively within mechanism and additively across mechanisms with sequential ordering:</w:t>
+      <w:r>
+        <w:rPr>
+          <w:rFonts w:ascii="Times New Roman" w:hAnsi="Times New Roman" w:cs="Times New Roman"/>
+          <w:bCs/>
+        </w:rPr>
+        <w:t>sub</w:t>
+      </w:r>
+      <w:r>
+        <w:rPr>
+          <w:rFonts w:ascii="Times New Roman" w:hAnsi="Times New Roman" w:cs="Times New Roman"/>
+          <w:bCs/>
+        </w:rPr>
+        <w:t>-cascades compose multiplicatively within mechanism and additively across mechanisms with sequential ordering:</w:t>
       </w:r>
     </w:p>
     <w:p>
@@ -9985,6 +10765,13 @@
           <w:rFonts w:ascii="Times New Roman" w:hAnsi="Times New Roman" w:cs="Times New Roman"/>
           <w:bCs/>
         </w:rPr>
+        <w:t>.</w:t>
+      </w:r>
+      <w:r>
+        <w:rPr>
+          <w:rFonts w:ascii="Times New Roman" w:hAnsi="Times New Roman" w:cs="Times New Roman"/>
+          <w:bCs/>
+        </w:rPr>
         <w:t xml:space="preserve"> </w:t>
       </w:r>
       <w:proofErr w:type="gramStart"/>
@@ -10543,7 +11330,21 @@
           <w:rFonts w:ascii="Times New Roman" w:hAnsi="Times New Roman" w:cs="Times New Roman"/>
           <w:bCs/>
         </w:rPr>
-        <w:t>13]</w:t>
+        <w:t>1</w:t>
+      </w:r>
+      <w:r>
+        <w:rPr>
+          <w:rFonts w:ascii="Times New Roman" w:hAnsi="Times New Roman" w:cs="Times New Roman"/>
+          <w:bCs/>
+        </w:rPr>
+        <w:t>4</w:t>
+      </w:r>
+      <w:r>
+        <w:rPr>
+          <w:rFonts w:ascii="Times New Roman" w:hAnsi="Times New Roman" w:cs="Times New Roman"/>
+          <w:bCs/>
+        </w:rPr>
+        <w:t>]</w:t>
       </w:r>
       <w:r>
         <w:rPr>
@@ -10573,7 +11374,14 @@
           <w:rFonts w:ascii="Times New Roman" w:hAnsi="Times New Roman" w:cs="Times New Roman"/>
           <w:bCs/>
         </w:rPr>
-        <w:t>29]</w:t>
+        <w:t>30</w:t>
+      </w:r>
+      <w:r>
+        <w:rPr>
+          <w:rFonts w:ascii="Times New Roman" w:hAnsi="Times New Roman" w:cs="Times New Roman"/>
+          <w:bCs/>
+        </w:rPr>
+        <w:t>]</w:t>
       </w:r>
       <w:r>
         <w:rPr>
@@ -10656,6 +11464,7 @@
         </w:rPr>
         <w:t xml:space="preserve"> dataset is publicly available at https://github.com/HPMLL/BurstGPT. Data center location data are from the U.S. Department of Energy / National Renewable Energy Laboratory Accelerating Speed to Power Data Viewer (</w:t>
       </w:r>
+      <w:proofErr w:type="gramStart"/>
       <w:r>
         <w:rPr>
           <w:rFonts w:ascii="Times New Roman" w:hAnsi="Times New Roman" w:cs="Times New Roman"/>
@@ -10669,6 +11478,21 @@
           <w:bCs/>
         </w:rPr>
         <w:t>)</w:t>
+      </w:r>
+      <w:r>
+        <w:rPr>
+          <w:rFonts w:ascii="Times New Roman" w:hAnsi="Times New Roman" w:cs="Times New Roman"/>
+          <w:bCs/>
+        </w:rPr>
+        <w:t>[</w:t>
+      </w:r>
+      <w:proofErr w:type="gramEnd"/>
+      <w:r>
+        <w:rPr>
+          <w:rFonts w:ascii="Times New Roman" w:hAnsi="Times New Roman" w:cs="Times New Roman"/>
+          <w:bCs/>
+        </w:rPr>
+        <w:t>13]</w:t>
       </w:r>
       <w:r>
         <w:rPr>
@@ -10796,11 +11620,7 @@
       <w:pPr>
         <w:rPr>
           <w:rFonts w:ascii="Times New Roman" w:hAnsi="Times New Roman" w:cs="Times New Roman"/>
-          <w:b/>
-          <w:bCs/>
-          <w:sz w:val="28"/>
-          <w:szCs w:val="28"/>
-          <w:highlight w:val="yellow"/>
+          <w:bCs/>
         </w:rPr>
       </w:pPr>
     </w:p>
@@ -11325,7 +12145,14 @@
           <w:rFonts w:ascii="Times New Roman" w:hAnsi="Times New Roman" w:cs="Times New Roman"/>
           <w:bCs/>
         </w:rPr>
-        <w:t xml:space="preserve"> E3 (Energy and Environmental Economics). 2025 Resource Adequacy Study for Illinois (2025).</w:t>
+        <w:t xml:space="preserve"> </w:t>
+      </w:r>
+      <w:r>
+        <w:rPr>
+          <w:rFonts w:ascii="Times New Roman" w:hAnsi="Times New Roman" w:cs="Times New Roman"/>
+          <w:bCs/>
+        </w:rPr>
+        <w:t>U.S. Department of Energy / National Renewable Energy Laboratory. "Data Center Demand Capacity by County." Accelerating Speed to Power Data Viewer. maps.nrel.gov/speed-to-power (accessed December 2025)</w:t>
       </w:r>
     </w:p>
     <w:p>
@@ -11340,7 +12167,103 @@
           <w:rFonts w:ascii="Times New Roman" w:hAnsi="Times New Roman" w:cs="Times New Roman"/>
           <w:bCs/>
         </w:rPr>
-        <w:t xml:space="preserve">[14] </w:t>
+        <w:t>[14]</w:t>
+      </w:r>
+      <w:r>
+        <w:rPr>
+          <w:rFonts w:ascii="Times New Roman" w:hAnsi="Times New Roman" w:cs="Times New Roman"/>
+          <w:bCs/>
+        </w:rPr>
+        <w:t xml:space="preserve"> E3 (Energy and Environmental Economics). 2025 Resource Adequacy Study for Illinois (2025).</w:t>
+      </w:r>
+    </w:p>
+    <w:p>
+      <w:pPr>
+        <w:rPr>
+          <w:rFonts w:ascii="Times New Roman" w:hAnsi="Times New Roman" w:cs="Times New Roman"/>
+          <w:bCs/>
+        </w:rPr>
+      </w:pPr>
+    </w:p>
+    <w:p>
+      <w:pPr>
+        <w:rPr>
+          <w:rFonts w:ascii="Times New Roman" w:hAnsi="Times New Roman" w:cs="Times New Roman"/>
+          <w:bCs/>
+        </w:rPr>
+      </w:pPr>
+      <w:r>
+        <w:rPr>
+          <w:rFonts w:ascii="Times New Roman" w:hAnsi="Times New Roman" w:cs="Times New Roman"/>
+          <w:bCs/>
+        </w:rPr>
+        <w:t>[1</w:t>
+      </w:r>
+      <w:r>
+        <w:rPr>
+          <w:rFonts w:ascii="Times New Roman" w:hAnsi="Times New Roman" w:cs="Times New Roman"/>
+          <w:bCs/>
+        </w:rPr>
+        <w:t>5</w:t>
+      </w:r>
+      <w:r>
+        <w:rPr>
+          <w:rFonts w:ascii="Times New Roman" w:hAnsi="Times New Roman" w:cs="Times New Roman"/>
+          <w:bCs/>
+        </w:rPr>
+        <w:t xml:space="preserve">] </w:t>
+      </w:r>
+      <w:r>
+        <w:rPr>
+          <w:rFonts w:ascii="Times New Roman" w:hAnsi="Times New Roman" w:cs="Times New Roman"/>
+          <w:bCs/>
+        </w:rPr>
+        <w:t xml:space="preserve">Knittel, C. R., Senga, J. R. L., &amp; Wang, S. Flexible Data Centers and the Grid: Lower Costs, Higher Emissions? </w:t>
+      </w:r>
+      <w:r>
+        <w:rPr>
+          <w:rFonts w:ascii="Times New Roman" w:hAnsi="Times New Roman" w:cs="Times New Roman"/>
+          <w:bCs/>
+          <w:i/>
+          <w:iCs/>
+        </w:rPr>
+        <w:t>NBER Working Paper No. 34065</w:t>
+      </w:r>
+      <w:r>
+        <w:rPr>
+          <w:rFonts w:ascii="Times New Roman" w:hAnsi="Times New Roman" w:cs="Times New Roman"/>
+          <w:bCs/>
+        </w:rPr>
+        <w:t>, National Bureau of Economic Research, July 2025. http://www.nber.org/papers/w34065.</w:t>
+      </w:r>
+    </w:p>
+    <w:p>
+      <w:pPr>
+        <w:rPr>
+          <w:rFonts w:ascii="Times New Roman" w:hAnsi="Times New Roman" w:cs="Times New Roman"/>
+          <w:bCs/>
+        </w:rPr>
+      </w:pPr>
+      <w:r>
+        <w:rPr>
+          <w:rFonts w:ascii="Times New Roman" w:hAnsi="Times New Roman" w:cs="Times New Roman"/>
+          <w:bCs/>
+        </w:rPr>
+        <w:t>[1</w:t>
+      </w:r>
+      <w:r>
+        <w:rPr>
+          <w:rFonts w:ascii="Times New Roman" w:hAnsi="Times New Roman" w:cs="Times New Roman"/>
+          <w:bCs/>
+        </w:rPr>
+        <w:t>6</w:t>
+      </w:r>
+      <w:r>
+        <w:rPr>
+          <w:rFonts w:ascii="Times New Roman" w:hAnsi="Times New Roman" w:cs="Times New Roman"/>
+          <w:bCs/>
+        </w:rPr>
+        <w:t xml:space="preserve">] </w:t>
       </w:r>
       <w:r>
         <w:rPr>
@@ -11392,8 +12315,21 @@
           <w:rFonts w:ascii="Times New Roman" w:hAnsi="Times New Roman" w:cs="Times New Roman"/>
           <w:bCs/>
         </w:rPr>
-        <w:lastRenderedPageBreak/>
-        <w:t xml:space="preserve">[15] </w:t>
+        <w:t>[1</w:t>
+      </w:r>
+      <w:r>
+        <w:rPr>
+          <w:rFonts w:ascii="Times New Roman" w:hAnsi="Times New Roman" w:cs="Times New Roman"/>
+          <w:bCs/>
+        </w:rPr>
+        <w:t>7</w:t>
+      </w:r>
+      <w:r>
+        <w:rPr>
+          <w:rFonts w:ascii="Times New Roman" w:hAnsi="Times New Roman" w:cs="Times New Roman"/>
+          <w:bCs/>
+        </w:rPr>
+        <w:t xml:space="preserve">] </w:t>
       </w:r>
       <w:r>
         <w:rPr>
@@ -11470,7 +12406,14 @@
           <w:rFonts w:ascii="Times New Roman" w:hAnsi="Times New Roman" w:cs="Times New Roman"/>
           <w:bCs/>
         </w:rPr>
-        <w:t>16</w:t>
+        <w:t>1</w:t>
+      </w:r>
+      <w:r>
+        <w:rPr>
+          <w:rFonts w:ascii="Times New Roman" w:hAnsi="Times New Roman" w:cs="Times New Roman"/>
+          <w:bCs/>
+        </w:rPr>
+        <w:t>8</w:t>
       </w:r>
       <w:r>
         <w:rPr>
@@ -11522,7 +12465,14 @@
           <w:rFonts w:ascii="Times New Roman" w:hAnsi="Times New Roman" w:cs="Times New Roman"/>
           <w:bCs/>
         </w:rPr>
-        <w:t>7]</w:t>
+        <w:t>9</w:t>
+      </w:r>
+      <w:r>
+        <w:rPr>
+          <w:rFonts w:ascii="Times New Roman" w:hAnsi="Times New Roman" w:cs="Times New Roman"/>
+          <w:bCs/>
+        </w:rPr>
+        <w:t>]</w:t>
       </w:r>
       <w:r>
         <w:rPr>
@@ -11560,44 +12510,35 @@
           <w:rFonts w:ascii="Times New Roman" w:hAnsi="Times New Roman" w:cs="Times New Roman"/>
           <w:bCs/>
         </w:rPr>
-        <w:t>[1</w:t>
-      </w:r>
-      <w:r>
-        <w:rPr>
-          <w:rFonts w:ascii="Times New Roman" w:hAnsi="Times New Roman" w:cs="Times New Roman"/>
-          <w:bCs/>
-        </w:rPr>
-        <w:t>8</w:t>
-      </w:r>
-      <w:r>
-        <w:rPr>
-          <w:rFonts w:ascii="Times New Roman" w:hAnsi="Times New Roman" w:cs="Times New Roman"/>
-          <w:bCs/>
-        </w:rPr>
-        <w:t xml:space="preserve">] </w:t>
-      </w:r>
-      <w:r>
-        <w:rPr>
-          <w:rFonts w:ascii="Times New Roman" w:hAnsi="Times New Roman" w:cs="Times New Roman"/>
-          <w:bCs/>
-        </w:rPr>
-        <w:t xml:space="preserve">Knittel, C. R., Senga, J. R. L., &amp; Wang, S. Flexible Data Centers and the Grid: Lower Costs, Higher Emissions? </w:t>
-      </w:r>
-      <w:r>
-        <w:rPr>
-          <w:rFonts w:ascii="Times New Roman" w:hAnsi="Times New Roman" w:cs="Times New Roman"/>
-          <w:bCs/>
-          <w:i/>
-          <w:iCs/>
-        </w:rPr>
-        <w:t>NBER Working Paper No. 34065</w:t>
-      </w:r>
-      <w:r>
-        <w:rPr>
-          <w:rFonts w:ascii="Times New Roman" w:hAnsi="Times New Roman" w:cs="Times New Roman"/>
-          <w:bCs/>
-        </w:rPr>
-        <w:t>, National Bureau of Economic Research, July 2025. http://www.nber.org/papers/w34065.</w:t>
+        <w:t>[</w:t>
+      </w:r>
+      <w:r>
+        <w:rPr>
+          <w:rFonts w:ascii="Times New Roman" w:hAnsi="Times New Roman" w:cs="Times New Roman"/>
+          <w:bCs/>
+        </w:rPr>
+        <w:t>20</w:t>
+      </w:r>
+      <w:r>
+        <w:rPr>
+          <w:rFonts w:ascii="Times New Roman" w:hAnsi="Times New Roman" w:cs="Times New Roman"/>
+          <w:bCs/>
+        </w:rPr>
+        <w:t xml:space="preserve">] NVIDIA Corporation. CUDA Compatibility, Release r595 (NVIDIA Corporation, March 31, 2026). </w:t>
+      </w:r>
+      <w:r>
+        <w:rPr>
+          <w:rFonts w:ascii="Times New Roman" w:hAnsi="Times New Roman" w:cs="Times New Roman"/>
+          <w:bCs/>
+        </w:rPr>
+        <w:t>https://docs.nvidia.com/deploy/cuda-compatibility/</w:t>
+      </w:r>
+      <w:r>
+        <w:rPr>
+          <w:rFonts w:ascii="Times New Roman" w:hAnsi="Times New Roman" w:cs="Times New Roman"/>
+          <w:bCs/>
+        </w:rPr>
+        <w:t>.</w:t>
       </w:r>
     </w:p>
     <w:p>
@@ -11619,21 +12560,37 @@
           <w:rFonts w:ascii="Times New Roman" w:hAnsi="Times New Roman" w:cs="Times New Roman"/>
           <w:bCs/>
         </w:rPr>
-        <w:t>19</w:t>
-      </w:r>
-      <w:r>
-        <w:rPr>
-          <w:rFonts w:ascii="Times New Roman" w:hAnsi="Times New Roman" w:cs="Times New Roman"/>
-          <w:bCs/>
-        </w:rPr>
-        <w:t xml:space="preserve">] NVIDIA Corporation. CUDA Compatibility, Release r595 (NVIDIA Corporation, March 31, 2026). </w:t>
-      </w:r>
-      <w:r>
-        <w:rPr>
-          <w:rFonts w:ascii="Times New Roman" w:hAnsi="Times New Roman" w:cs="Times New Roman"/>
-          <w:bCs/>
-        </w:rPr>
-        <w:t>https://docs.nvidia.com/deploy/cuda-compatibility/</w:t>
+        <w:t>21</w:t>
+      </w:r>
+      <w:r>
+        <w:rPr>
+          <w:rFonts w:ascii="Times New Roman" w:hAnsi="Times New Roman" w:cs="Times New Roman"/>
+          <w:bCs/>
+        </w:rPr>
+        <w:t xml:space="preserve">] Dayan, O., Neria, N., &amp; Karabulut, E. Reducing Cold Start Latency for LLM Inference with NVIDIA </w:t>
+      </w:r>
+      <w:proofErr w:type="spellStart"/>
+      <w:r>
+        <w:rPr>
+          <w:rFonts w:ascii="Times New Roman" w:hAnsi="Times New Roman" w:cs="Times New Roman"/>
+          <w:bCs/>
+        </w:rPr>
+        <w:t>Run:ai</w:t>
+      </w:r>
+      <w:proofErr w:type="spellEnd"/>
+      <w:r>
+        <w:rPr>
+          <w:rFonts w:ascii="Times New Roman" w:hAnsi="Times New Roman" w:cs="Times New Roman"/>
+          <w:bCs/>
+        </w:rPr>
+        <w:t xml:space="preserve"> Model Streamer. NVIDIA Technical Blog (September 16, 2025). </w:t>
+      </w:r>
+      <w:r>
+        <w:rPr>
+          <w:rFonts w:ascii="Times New Roman" w:hAnsi="Times New Roman" w:cs="Times New Roman"/>
+          <w:bCs/>
+        </w:rPr>
+        <w:t>https://developer.nvidia.com/blog/reducing-cold-start-latency-for-llm-inference-with-nvidia-runai-model-streamer/</w:t>
       </w:r>
       <w:r>
         <w:rPr>
@@ -11662,14 +12619,14 @@
           <w:rFonts w:ascii="Times New Roman" w:hAnsi="Times New Roman" w:cs="Times New Roman"/>
           <w:bCs/>
         </w:rPr>
-        <w:t>0</w:t>
-      </w:r>
-      <w:r>
-        <w:rPr>
-          <w:rFonts w:ascii="Times New Roman" w:hAnsi="Times New Roman" w:cs="Times New Roman"/>
-          <w:bCs/>
-        </w:rPr>
-        <w:t xml:space="preserve">] Dayan, O., Neria, N., &amp; Karabulut, E. Reducing Cold Start Latency for LLM Inference with NVIDIA </w:t>
+        <w:t>2</w:t>
+      </w:r>
+      <w:r>
+        <w:rPr>
+          <w:rFonts w:ascii="Times New Roman" w:hAnsi="Times New Roman" w:cs="Times New Roman"/>
+          <w:bCs/>
+        </w:rPr>
+        <w:t xml:space="preserve">] Jain, S., Kumar, A., Mandal, S., Ong, J., </w:t>
       </w:r>
       <w:proofErr w:type="spellStart"/>
       <w:r>
@@ -11677,7 +12634,7 @@
           <w:rFonts w:ascii="Times New Roman" w:hAnsi="Times New Roman" w:cs="Times New Roman"/>
           <w:bCs/>
         </w:rPr>
-        <w:t>Run:ai</w:t>
+        <w:t>Poutievski</w:t>
       </w:r>
       <w:proofErr w:type="spellEnd"/>
       <w:r>
@@ -11685,21 +12642,23 @@
           <w:rFonts w:ascii="Times New Roman" w:hAnsi="Times New Roman" w:cs="Times New Roman"/>
           <w:bCs/>
         </w:rPr>
-        <w:t xml:space="preserve"> Model Streamer. NVIDIA Technical Blog (September 16, 2025). </w:t>
-      </w:r>
-      <w:r>
-        <w:rPr>
-          <w:rFonts w:ascii="Times New Roman" w:hAnsi="Times New Roman" w:cs="Times New Roman"/>
-          <w:bCs/>
-        </w:rPr>
-        <w:t>https://developer.nvidia.com/blog/reducing-cold-start-latency-for-llm-inference-with-nvidia-runai-model-streamer/</w:t>
-      </w:r>
-      <w:r>
-        <w:rPr>
-          <w:rFonts w:ascii="Times New Roman" w:hAnsi="Times New Roman" w:cs="Times New Roman"/>
-          <w:bCs/>
-        </w:rPr>
-        <w:t>.</w:t>
+        <w:t xml:space="preserve">, L., Singh, A., Venkata, S., Wanderer, J., Zhou, J., Zhu, M., Zolla, J., </w:t>
+      </w:r>
+      <w:proofErr w:type="spellStart"/>
+      <w:r>
+        <w:rPr>
+          <w:rFonts w:ascii="Times New Roman" w:hAnsi="Times New Roman" w:cs="Times New Roman"/>
+          <w:bCs/>
+        </w:rPr>
+        <w:t>Hölzle</w:t>
+      </w:r>
+      <w:proofErr w:type="spellEnd"/>
+      <w:r>
+        <w:rPr>
+          <w:rFonts w:ascii="Times New Roman" w:hAnsi="Times New Roman" w:cs="Times New Roman"/>
+          <w:bCs/>
+        </w:rPr>
+        <w:t>, U., Stuart, S., &amp; Vahdat, A. B4: Experience with a Globally-Deployed Software Defined WAN. Proceedings of the ACM SIGCOMM 2013 Conference (Hong Kong, China, August 2013), pp. 3–14.</w:t>
       </w:r>
     </w:p>
     <w:p>
@@ -11721,46 +12680,14 @@
           <w:rFonts w:ascii="Times New Roman" w:hAnsi="Times New Roman" w:cs="Times New Roman"/>
           <w:bCs/>
         </w:rPr>
-        <w:t>1</w:t>
-      </w:r>
-      <w:r>
-        <w:rPr>
-          <w:rFonts w:ascii="Times New Roman" w:hAnsi="Times New Roman" w:cs="Times New Roman"/>
-          <w:bCs/>
-        </w:rPr>
-        <w:t xml:space="preserve">] Jain, S., Kumar, A., Mandal, S., Ong, J., </w:t>
-      </w:r>
-      <w:proofErr w:type="spellStart"/>
-      <w:r>
-        <w:rPr>
-          <w:rFonts w:ascii="Times New Roman" w:hAnsi="Times New Roman" w:cs="Times New Roman"/>
-          <w:bCs/>
-        </w:rPr>
-        <w:t>Poutievski</w:t>
-      </w:r>
-      <w:proofErr w:type="spellEnd"/>
-      <w:r>
-        <w:rPr>
-          <w:rFonts w:ascii="Times New Roman" w:hAnsi="Times New Roman" w:cs="Times New Roman"/>
-          <w:bCs/>
-        </w:rPr>
-        <w:t xml:space="preserve">, L., Singh, A., Venkata, S., Wanderer, J., Zhou, J., Zhu, M., Zolla, J., </w:t>
-      </w:r>
-      <w:proofErr w:type="spellStart"/>
-      <w:r>
-        <w:rPr>
-          <w:rFonts w:ascii="Times New Roman" w:hAnsi="Times New Roman" w:cs="Times New Roman"/>
-          <w:bCs/>
-        </w:rPr>
-        <w:t>Hölzle</w:t>
-      </w:r>
-      <w:proofErr w:type="spellEnd"/>
-      <w:r>
-        <w:rPr>
-          <w:rFonts w:ascii="Times New Roman" w:hAnsi="Times New Roman" w:cs="Times New Roman"/>
-          <w:bCs/>
-        </w:rPr>
-        <w:t>, U., Stuart, S., &amp; Vahdat, A. B4: Experience with a Globally-Deployed Software Defined WAN. Proceedings of the ACM SIGCOMM 2013 Conference (Hong Kong, China, August 2013), pp. 3–14.</w:t>
+        <w:t>3</w:t>
+      </w:r>
+      <w:r>
+        <w:rPr>
+          <w:rFonts w:ascii="Times New Roman" w:hAnsi="Times New Roman" w:cs="Times New Roman"/>
+          <w:bCs/>
+        </w:rPr>
+        <w:t>] Zayo Group. The Bandwidth Report: Insights &amp; Trends Driving the Bandwidth Boom (Zayo, 2025).</w:t>
       </w:r>
     </w:p>
     <w:p>
@@ -11782,14 +12709,14 @@
           <w:rFonts w:ascii="Times New Roman" w:hAnsi="Times New Roman" w:cs="Times New Roman"/>
           <w:bCs/>
         </w:rPr>
-        <w:t>2</w:t>
-      </w:r>
-      <w:r>
-        <w:rPr>
-          <w:rFonts w:ascii="Times New Roman" w:hAnsi="Times New Roman" w:cs="Times New Roman"/>
-          <w:bCs/>
-        </w:rPr>
-        <w:t>] Zayo Group. The Bandwidth Report: Insights &amp; Trends Driving the Bandwidth Boom (Zayo, 2025).</w:t>
+        <w:t>4</w:t>
+      </w:r>
+      <w:r>
+        <w:rPr>
+          <w:rFonts w:ascii="Times New Roman" w:hAnsi="Times New Roman" w:cs="Times New Roman"/>
+          <w:bCs/>
+        </w:rPr>
+        <w:t>] Wu, Q., Deng, Q., Ganesh, L., Hsu, C.-H., Jin, Y., Kumar, S., Li, B., Meza, J., &amp; Song, Y. J. Dynamo: Facebook's Data Center-Wide Power Management System. Proceedings of the 43rd ACM/IEEE International Symposium on Computer Architecture (ISCA) (Seoul, Korea, June 2016), pp. 469–480. DOI: 10.1109/ISCA.2016.48.</w:t>
       </w:r>
     </w:p>
     <w:p>
@@ -11811,14 +12738,28 @@
           <w:rFonts w:ascii="Times New Roman" w:hAnsi="Times New Roman" w:cs="Times New Roman"/>
           <w:bCs/>
         </w:rPr>
-        <w:t>3</w:t>
-      </w:r>
-      <w:r>
-        <w:rPr>
-          <w:rFonts w:ascii="Times New Roman" w:hAnsi="Times New Roman" w:cs="Times New Roman"/>
-          <w:bCs/>
-        </w:rPr>
-        <w:t>] Wu, Q., Deng, Q., Ganesh, L., Hsu, C.-H., Jin, Y., Kumar, S., Li, B., Meza, J., &amp; Song, Y. J. Dynamo: Facebook's Data Center-Wide Power Management System. Proceedings of the 43rd ACM/IEEE International Symposium on Computer Architecture (ISCA) (Seoul, Korea, June 2016), pp. 469–480. DOI: 10.1109/ISCA.2016.48.</w:t>
+        <w:t>5</w:t>
+      </w:r>
+      <w:r>
+        <w:rPr>
+          <w:rFonts w:ascii="Times New Roman" w:hAnsi="Times New Roman" w:cs="Times New Roman"/>
+          <w:bCs/>
+        </w:rPr>
+        <w:t xml:space="preserve">] Ciampoli, P. Google, TVA Enter Agreement Tied to Data Center Demand Response. American Public Power Association (August 4, 2025). </w:t>
+      </w:r>
+      <w:r>
+        <w:rPr>
+          <w:rFonts w:ascii="Times New Roman" w:hAnsi="Times New Roman" w:cs="Times New Roman"/>
+          <w:bCs/>
+        </w:rPr>
+        <w:t>https://www.publicpower.org/periodical/article/google-tva-enter-agreement-tied-data-center-demand-response</w:t>
+      </w:r>
+      <w:r>
+        <w:rPr>
+          <w:rFonts w:ascii="Times New Roman" w:hAnsi="Times New Roman" w:cs="Times New Roman"/>
+          <w:bCs/>
+        </w:rPr>
+        <w:t>.</w:t>
       </w:r>
     </w:p>
     <w:p>
@@ -11833,6 +12774,7 @@
           <w:rFonts w:ascii="Times New Roman" w:hAnsi="Times New Roman" w:cs="Times New Roman"/>
           <w:bCs/>
         </w:rPr>
+        <w:lastRenderedPageBreak/>
         <w:t>[2</w:t>
       </w:r>
       <w:r>
@@ -11840,28 +12782,69 @@
           <w:rFonts w:ascii="Times New Roman" w:hAnsi="Times New Roman" w:cs="Times New Roman"/>
           <w:bCs/>
         </w:rPr>
-        <w:t>4</w:t>
-      </w:r>
-      <w:r>
-        <w:rPr>
-          <w:rFonts w:ascii="Times New Roman" w:hAnsi="Times New Roman" w:cs="Times New Roman"/>
-          <w:bCs/>
-        </w:rPr>
-        <w:t xml:space="preserve">] Ciampoli, P. Google, TVA Enter Agreement Tied to Data Center Demand Response. American Public Power Association (August 4, 2025). </w:t>
-      </w:r>
-      <w:r>
-        <w:rPr>
-          <w:rFonts w:ascii="Times New Roman" w:hAnsi="Times New Roman" w:cs="Times New Roman"/>
-          <w:bCs/>
-        </w:rPr>
-        <w:t>https://www.publicpower.org/periodical/article/google-tva-enter-agreement-tied-data-center-demand-response</w:t>
-      </w:r>
-      <w:r>
-        <w:rPr>
-          <w:rFonts w:ascii="Times New Roman" w:hAnsi="Times New Roman" w:cs="Times New Roman"/>
-          <w:bCs/>
-        </w:rPr>
-        <w:t>.</w:t>
+        <w:t>6</w:t>
+      </w:r>
+      <w:r>
+        <w:rPr>
+          <w:rFonts w:ascii="Times New Roman" w:hAnsi="Times New Roman" w:cs="Times New Roman"/>
+          <w:bCs/>
+        </w:rPr>
+        <w:t xml:space="preserve">] </w:t>
+      </w:r>
+      <w:r>
+        <w:rPr>
+          <w:rFonts w:ascii="Times New Roman" w:hAnsi="Times New Roman" w:cs="Times New Roman"/>
+          <w:bCs/>
+        </w:rPr>
+        <w:t xml:space="preserve">Jaiswal, S., Jain, K., </w:t>
+      </w:r>
+      <w:proofErr w:type="spellStart"/>
+      <w:r>
+        <w:rPr>
+          <w:rFonts w:ascii="Times New Roman" w:hAnsi="Times New Roman" w:cs="Times New Roman"/>
+          <w:bCs/>
+        </w:rPr>
+        <w:t>Simmhan</w:t>
+      </w:r>
+      <w:proofErr w:type="spellEnd"/>
+      <w:r>
+        <w:rPr>
+          <w:rFonts w:ascii="Times New Roman" w:hAnsi="Times New Roman" w:cs="Times New Roman"/>
+          <w:bCs/>
+        </w:rPr>
+        <w:t xml:space="preserve">, Y., </w:t>
+      </w:r>
+      <w:proofErr w:type="spellStart"/>
+      <w:r>
+        <w:rPr>
+          <w:rFonts w:ascii="Times New Roman" w:hAnsi="Times New Roman" w:cs="Times New Roman"/>
+          <w:bCs/>
+        </w:rPr>
+        <w:t>Parayil</w:t>
+      </w:r>
+      <w:proofErr w:type="spellEnd"/>
+      <w:r>
+        <w:rPr>
+          <w:rFonts w:ascii="Times New Roman" w:hAnsi="Times New Roman" w:cs="Times New Roman"/>
+          <w:bCs/>
+        </w:rPr>
+        <w:t xml:space="preserve">, A., Mallick, A., St. Amant, R., et al. </w:t>
+      </w:r>
+      <w:proofErr w:type="spellStart"/>
+      <w:r>
+        <w:rPr>
+          <w:rFonts w:ascii="Times New Roman" w:hAnsi="Times New Roman" w:cs="Times New Roman"/>
+          <w:bCs/>
+        </w:rPr>
+        <w:t>SageServe</w:t>
+      </w:r>
+      <w:proofErr w:type="spellEnd"/>
+      <w:r>
+        <w:rPr>
+          <w:rFonts w:ascii="Times New Roman" w:hAnsi="Times New Roman" w:cs="Times New Roman"/>
+          <w:bCs/>
+        </w:rPr>
+        <w:t>: Optimizing LLM Serving on Cloud Data Centers with Forecast Aware Auto-Scaling. arXiv:2502.14617 (2025).</w:t>
       </w:r>
     </w:p>
     <w:p>
@@ -11876,14 +12859,21 @@
           <w:rFonts w:ascii="Times New Roman" w:hAnsi="Times New Roman" w:cs="Times New Roman"/>
           <w:bCs/>
         </w:rPr>
-        <w:t xml:space="preserve">[25] </w:t>
-      </w:r>
-      <w:r>
-        <w:rPr>
-          <w:rFonts w:ascii="Times New Roman" w:hAnsi="Times New Roman" w:cs="Times New Roman"/>
-          <w:bCs/>
-        </w:rPr>
-        <w:t xml:space="preserve">Jaiswal, S., Jain, K., </w:t>
+        <w:t>[2</w:t>
+      </w:r>
+      <w:r>
+        <w:rPr>
+          <w:rFonts w:ascii="Times New Roman" w:hAnsi="Times New Roman" w:cs="Times New Roman"/>
+          <w:bCs/>
+        </w:rPr>
+        <w:t>7</w:t>
+      </w:r>
+      <w:r>
+        <w:rPr>
+          <w:rFonts w:ascii="Times New Roman" w:hAnsi="Times New Roman" w:cs="Times New Roman"/>
+          <w:bCs/>
+        </w:rPr>
+        <w:t xml:space="preserve">] Patel, P., </w:t>
       </w:r>
       <w:proofErr w:type="spellStart"/>
       <w:r>
@@ -11891,7 +12881,7 @@
           <w:rFonts w:ascii="Times New Roman" w:hAnsi="Times New Roman" w:cs="Times New Roman"/>
           <w:bCs/>
         </w:rPr>
-        <w:t>Simmhan</w:t>
+        <w:t>Choukse</w:t>
       </w:r>
       <w:proofErr w:type="spellEnd"/>
       <w:r>
@@ -11899,7 +12889,7 @@
           <w:rFonts w:ascii="Times New Roman" w:hAnsi="Times New Roman" w:cs="Times New Roman"/>
           <w:bCs/>
         </w:rPr>
-        <w:t xml:space="preserve">, Y., </w:t>
+        <w:t xml:space="preserve">, E., Zhang, C., </w:t>
       </w:r>
       <w:proofErr w:type="spellStart"/>
       <w:r>
@@ -11907,7 +12897,7 @@
           <w:rFonts w:ascii="Times New Roman" w:hAnsi="Times New Roman" w:cs="Times New Roman"/>
           <w:bCs/>
         </w:rPr>
-        <w:t>Parayil</w:t>
+        <w:t>Goiri</w:t>
       </w:r>
       <w:proofErr w:type="spellEnd"/>
       <w:r>
@@ -11915,23 +12905,23 @@
           <w:rFonts w:ascii="Times New Roman" w:hAnsi="Times New Roman" w:cs="Times New Roman"/>
           <w:bCs/>
         </w:rPr>
-        <w:t xml:space="preserve">, A., Mallick, A., St. Amant, R., et al. </w:t>
-      </w:r>
-      <w:proofErr w:type="spellStart"/>
-      <w:r>
-        <w:rPr>
-          <w:rFonts w:ascii="Times New Roman" w:hAnsi="Times New Roman" w:cs="Times New Roman"/>
-          <w:bCs/>
-        </w:rPr>
-        <w:t>SageServe</w:t>
-      </w:r>
-      <w:proofErr w:type="spellEnd"/>
-      <w:r>
-        <w:rPr>
-          <w:rFonts w:ascii="Times New Roman" w:hAnsi="Times New Roman" w:cs="Times New Roman"/>
-          <w:bCs/>
-        </w:rPr>
-        <w:t>: Optimizing LLM Serving on Cloud Data Centers with Forecast Aware Auto-Scaling. arXiv:2502.14617 (2025).</w:t>
+        <w:t xml:space="preserve">, Í., Warrier, B., Mahalingam, N., &amp; Bianchini, R. Characterizing Power Management Opportunities for LLMs in the Cloud. </w:t>
+      </w:r>
+      <w:r>
+        <w:rPr>
+          <w:rFonts w:ascii="Times New Roman" w:hAnsi="Times New Roman" w:cs="Times New Roman"/>
+          <w:bCs/>
+          <w:i/>
+          <w:iCs/>
+        </w:rPr>
+        <w:t>Proceedings of the 29th ACM International Conference on Architectural Support for Programming Languages and Operating Systems (ASPLOS '24)</w:t>
+      </w:r>
+      <w:r>
+        <w:rPr>
+          <w:rFonts w:ascii="Times New Roman" w:hAnsi="Times New Roman" w:cs="Times New Roman"/>
+          <w:bCs/>
+        </w:rPr>
+        <w:t>, Volume 3 (San Diego, CA, April–May 2024), pp. 207–222.</w:t>
       </w:r>
     </w:p>
     <w:p>
@@ -11953,14 +12943,14 @@
           <w:rFonts w:ascii="Times New Roman" w:hAnsi="Times New Roman" w:cs="Times New Roman"/>
           <w:bCs/>
         </w:rPr>
-        <w:t>6</w:t>
-      </w:r>
-      <w:r>
-        <w:rPr>
-          <w:rFonts w:ascii="Times New Roman" w:hAnsi="Times New Roman" w:cs="Times New Roman"/>
-          <w:bCs/>
-        </w:rPr>
-        <w:t xml:space="preserve">] Patel, P., </w:t>
+        <w:t>8</w:t>
+      </w:r>
+      <w:r>
+        <w:rPr>
+          <w:rFonts w:ascii="Times New Roman" w:hAnsi="Times New Roman" w:cs="Times New Roman"/>
+          <w:bCs/>
+        </w:rPr>
+        <w:t xml:space="preserve">] </w:t>
       </w:r>
       <w:proofErr w:type="spellStart"/>
       <w:r>
@@ -11968,7 +12958,7 @@
           <w:rFonts w:ascii="Times New Roman" w:hAnsi="Times New Roman" w:cs="Times New Roman"/>
           <w:bCs/>
         </w:rPr>
-        <w:t>Choukse</w:t>
+        <w:t>Kakolyris</w:t>
       </w:r>
       <w:proofErr w:type="spellEnd"/>
       <w:r>
@@ -11976,7 +12966,7 @@
           <w:rFonts w:ascii="Times New Roman" w:hAnsi="Times New Roman" w:cs="Times New Roman"/>
           <w:bCs/>
         </w:rPr>
-        <w:t xml:space="preserve">, E., Zhang, C., </w:t>
+        <w:t xml:space="preserve">, A. K., </w:t>
       </w:r>
       <w:proofErr w:type="spellStart"/>
       <w:r>
@@ -11984,7 +12974,7 @@
           <w:rFonts w:ascii="Times New Roman" w:hAnsi="Times New Roman" w:cs="Times New Roman"/>
           <w:bCs/>
         </w:rPr>
-        <w:t>Goiri</w:t>
+        <w:t>Masouros</w:t>
       </w:r>
       <w:proofErr w:type="spellEnd"/>
       <w:r>
@@ -11992,7 +12982,23 @@
           <w:rFonts w:ascii="Times New Roman" w:hAnsi="Times New Roman" w:cs="Times New Roman"/>
           <w:bCs/>
         </w:rPr>
-        <w:t xml:space="preserve">, Í., Warrier, B., Mahalingam, N., &amp; Bianchini, R. Characterizing Power Management Opportunities for LLMs in the Cloud. </w:t>
+        <w:t xml:space="preserve">, D., Xydis, S., &amp; </w:t>
+      </w:r>
+      <w:proofErr w:type="spellStart"/>
+      <w:r>
+        <w:rPr>
+          <w:rFonts w:ascii="Times New Roman" w:hAnsi="Times New Roman" w:cs="Times New Roman"/>
+          <w:bCs/>
+        </w:rPr>
+        <w:t>Soudris</w:t>
+      </w:r>
+      <w:proofErr w:type="spellEnd"/>
+      <w:r>
+        <w:rPr>
+          <w:rFonts w:ascii="Times New Roman" w:hAnsi="Times New Roman" w:cs="Times New Roman"/>
+          <w:bCs/>
+        </w:rPr>
+        <w:t xml:space="preserve">, D. SLO-Aware GPU DVFS for Energy-Efficient LLM Inference Serving. </w:t>
       </w:r>
       <w:r>
         <w:rPr>
@@ -12001,24 +13007,14 @@
           <w:i/>
           <w:iCs/>
         </w:rPr>
-        <w:t xml:space="preserve">Proceedings of the </w:t>
-      </w:r>
-      <w:r>
-        <w:rPr>
-          <w:rFonts w:ascii="Times New Roman" w:hAnsi="Times New Roman" w:cs="Times New Roman"/>
-          <w:bCs/>
-          <w:i/>
-          <w:iCs/>
-        </w:rPr>
-        <w:lastRenderedPageBreak/>
-        <w:t>29th ACM International Conference on Architectural Support for Programming Languages and Operating Systems (ASPLOS '24)</w:t>
-      </w:r>
-      <w:r>
-        <w:rPr>
-          <w:rFonts w:ascii="Times New Roman" w:hAnsi="Times New Roman" w:cs="Times New Roman"/>
-          <w:bCs/>
-        </w:rPr>
-        <w:t>, Volume 3 (San Diego, CA, April–May 2024), pp. 207–222.</w:t>
+        <w:t>IEEE Computer Architecture Letters</w:t>
+      </w:r>
+      <w:r>
+        <w:rPr>
+          <w:rFonts w:ascii="Times New Roman" w:hAnsi="Times New Roman" w:cs="Times New Roman"/>
+          <w:bCs/>
+        </w:rPr>
+        <w:t xml:space="preserve"> 23, no. 2 (July–December 2024): 150–153.</w:t>
       </w:r>
     </w:p>
     <w:p>
@@ -12040,14 +13036,14 @@
           <w:rFonts w:ascii="Times New Roman" w:hAnsi="Times New Roman" w:cs="Times New Roman"/>
           <w:bCs/>
         </w:rPr>
-        <w:t>7</w:t>
-      </w:r>
-      <w:r>
-        <w:rPr>
-          <w:rFonts w:ascii="Times New Roman" w:hAnsi="Times New Roman" w:cs="Times New Roman"/>
-          <w:bCs/>
-        </w:rPr>
-        <w:t xml:space="preserve">] </w:t>
+        <w:t>9</w:t>
+      </w:r>
+      <w:r>
+        <w:rPr>
+          <w:rFonts w:ascii="Times New Roman" w:hAnsi="Times New Roman" w:cs="Times New Roman"/>
+          <w:bCs/>
+        </w:rPr>
+        <w:t xml:space="preserve">] Wang, Y., Chen, Y., Li, Z., Kang, X., Tang, Z., He, X., Guo, R., Wang, X., Wang, Q., Zhou, A. C., &amp; Chu, X. </w:t>
       </w:r>
       <w:proofErr w:type="spellStart"/>
       <w:r>
@@ -12055,7 +13051,7 @@
           <w:rFonts w:ascii="Times New Roman" w:hAnsi="Times New Roman" w:cs="Times New Roman"/>
           <w:bCs/>
         </w:rPr>
-        <w:t>Kakolyris</w:t>
+        <w:t>BurstGPT</w:t>
       </w:r>
       <w:proofErr w:type="spellEnd"/>
       <w:r>
@@ -12063,55 +13059,21 @@
           <w:rFonts w:ascii="Times New Roman" w:hAnsi="Times New Roman" w:cs="Times New Roman"/>
           <w:bCs/>
         </w:rPr>
-        <w:t xml:space="preserve">, A. K., </w:t>
-      </w:r>
-      <w:proofErr w:type="spellStart"/>
-      <w:r>
-        <w:rPr>
-          <w:rFonts w:ascii="Times New Roman" w:hAnsi="Times New Roman" w:cs="Times New Roman"/>
-          <w:bCs/>
-        </w:rPr>
-        <w:t>Masouros</w:t>
-      </w:r>
-      <w:proofErr w:type="spellEnd"/>
-      <w:r>
-        <w:rPr>
-          <w:rFonts w:ascii="Times New Roman" w:hAnsi="Times New Roman" w:cs="Times New Roman"/>
-          <w:bCs/>
-        </w:rPr>
-        <w:t xml:space="preserve">, D., Xydis, S., &amp; </w:t>
-      </w:r>
-      <w:proofErr w:type="spellStart"/>
-      <w:r>
-        <w:rPr>
-          <w:rFonts w:ascii="Times New Roman" w:hAnsi="Times New Roman" w:cs="Times New Roman"/>
-          <w:bCs/>
-        </w:rPr>
-        <w:t>Soudris</w:t>
-      </w:r>
-      <w:proofErr w:type="spellEnd"/>
-      <w:r>
-        <w:rPr>
-          <w:rFonts w:ascii="Times New Roman" w:hAnsi="Times New Roman" w:cs="Times New Roman"/>
-          <w:bCs/>
-        </w:rPr>
-        <w:t xml:space="preserve">, D. SLO-Aware GPU DVFS for Energy-Efficient LLM Inference Serving. </w:t>
-      </w:r>
-      <w:r>
-        <w:rPr>
-          <w:rFonts w:ascii="Times New Roman" w:hAnsi="Times New Roman" w:cs="Times New Roman"/>
-          <w:bCs/>
-          <w:i/>
-          <w:iCs/>
-        </w:rPr>
-        <w:t>IEEE Computer Architecture Letters</w:t>
-      </w:r>
-      <w:r>
-        <w:rPr>
-          <w:rFonts w:ascii="Times New Roman" w:hAnsi="Times New Roman" w:cs="Times New Roman"/>
-          <w:bCs/>
-        </w:rPr>
-        <w:t xml:space="preserve"> 23, no. 2 (July–December 2024): 150–153.</w:t>
+        <w:t xml:space="preserve">: A Real-World Workload Dataset to Optimize LLM Serving Systems. arXiv:2401.17644v3 (June 17, 2024). </w:t>
+      </w:r>
+      <w:r>
+        <w:rPr>
+          <w:rFonts w:ascii="Times New Roman" w:hAnsi="Times New Roman" w:cs="Times New Roman"/>
+          <w:bCs/>
+        </w:rPr>
+        <w:t>https://arxiv.org/abs/2401.17644v3</w:t>
+      </w:r>
+      <w:r>
+        <w:rPr>
+          <w:rFonts w:ascii="Times New Roman" w:hAnsi="Times New Roman" w:cs="Times New Roman"/>
+          <w:bCs/>
+        </w:rPr>
+        <w:t>.</w:t>
       </w:r>
     </w:p>
     <w:p>
@@ -12126,65 +13088,6 @@
           <w:rFonts w:ascii="Times New Roman" w:hAnsi="Times New Roman" w:cs="Times New Roman"/>
           <w:bCs/>
         </w:rPr>
-        <w:t>[2</w:t>
-      </w:r>
-      <w:r>
-        <w:rPr>
-          <w:rFonts w:ascii="Times New Roman" w:hAnsi="Times New Roman" w:cs="Times New Roman"/>
-          <w:bCs/>
-        </w:rPr>
-        <w:t>8</w:t>
-      </w:r>
-      <w:r>
-        <w:rPr>
-          <w:rFonts w:ascii="Times New Roman" w:hAnsi="Times New Roman" w:cs="Times New Roman"/>
-          <w:bCs/>
-        </w:rPr>
-        <w:t xml:space="preserve">] Wang, Y., Chen, Y., Li, Z., Kang, X., Tang, Z., He, X., Guo, R., Wang, X., Wang, Q., Zhou, A. C., &amp; Chu, X. </w:t>
-      </w:r>
-      <w:proofErr w:type="spellStart"/>
-      <w:r>
-        <w:rPr>
-          <w:rFonts w:ascii="Times New Roman" w:hAnsi="Times New Roman" w:cs="Times New Roman"/>
-          <w:bCs/>
-        </w:rPr>
-        <w:t>BurstGPT</w:t>
-      </w:r>
-      <w:proofErr w:type="spellEnd"/>
-      <w:r>
-        <w:rPr>
-          <w:rFonts w:ascii="Times New Roman" w:hAnsi="Times New Roman" w:cs="Times New Roman"/>
-          <w:bCs/>
-        </w:rPr>
-        <w:t xml:space="preserve">: A Real-World Workload Dataset to Optimize LLM Serving Systems. arXiv:2401.17644v3 (June 17, 2024). </w:t>
-      </w:r>
-      <w:r>
-        <w:rPr>
-          <w:rFonts w:ascii="Times New Roman" w:hAnsi="Times New Roman" w:cs="Times New Roman"/>
-          <w:bCs/>
-        </w:rPr>
-        <w:t>https://arxiv.org/abs/2401.17644v3</w:t>
-      </w:r>
-      <w:r>
-        <w:rPr>
-          <w:rFonts w:ascii="Times New Roman" w:hAnsi="Times New Roman" w:cs="Times New Roman"/>
-          <w:bCs/>
-        </w:rPr>
-        <w:t>.</w:t>
-      </w:r>
-    </w:p>
-    <w:p>
-      <w:pPr>
-        <w:rPr>
-          <w:rFonts w:ascii="Times New Roman" w:hAnsi="Times New Roman" w:cs="Times New Roman"/>
-          <w:bCs/>
-        </w:rPr>
-      </w:pPr>
-      <w:r>
-        <w:rPr>
-          <w:rFonts w:ascii="Times New Roman" w:hAnsi="Times New Roman" w:cs="Times New Roman"/>
-          <w:bCs/>
-        </w:rPr>
         <w:t>[</w:t>
       </w:r>
       <w:r>
@@ -12192,7 +13095,7 @@
           <w:rFonts w:ascii="Times New Roman" w:hAnsi="Times New Roman" w:cs="Times New Roman"/>
           <w:bCs/>
         </w:rPr>
-        <w:t>29</w:t>
+        <w:t>30</w:t>
       </w:r>
       <w:r>
         <w:rPr>
@@ -12258,6 +13161,7 @@
           <w:noProof/>
           <w:highlight w:val="yellow"/>
         </w:rPr>
+        <w:lastRenderedPageBreak/>
         <w:drawing>
           <wp:inline distT="0" distB="0" distL="0" distR="0" wp14:anchorId="033A30D4" wp14:editId="2B483383">
             <wp:extent cx="5852172" cy="3746000"/>
@@ -18604,6 +19508,50 @@
       <w:vertAlign w:val="superscript"/>
     </w:rPr>
   </w:style>
+  <w:style w:type="paragraph" w:styleId="Header">
+    <w:name w:val="header"/>
+    <w:basedOn w:val="Normal"/>
+    <w:link w:val="HeaderChar"/>
+    <w:uiPriority w:val="99"/>
+    <w:unhideWhenUsed/>
+    <w:rsid w:val="00AA2EA2"/>
+    <w:pPr>
+      <w:tabs>
+        <w:tab w:val="center" w:pos="4680"/>
+        <w:tab w:val="right" w:pos="9360"/>
+      </w:tabs>
+      <w:spacing w:after="0" w:line="240" w:lineRule="auto"/>
+    </w:pPr>
+  </w:style>
+  <w:style w:type="character" w:customStyle="1" w:styleId="HeaderChar">
+    <w:name w:val="Header Char"/>
+    <w:basedOn w:val="DefaultParagraphFont"/>
+    <w:link w:val="Header"/>
+    <w:uiPriority w:val="99"/>
+    <w:rsid w:val="00AA2EA2"/>
+  </w:style>
+  <w:style w:type="paragraph" w:styleId="Footer">
+    <w:name w:val="footer"/>
+    <w:basedOn w:val="Normal"/>
+    <w:link w:val="FooterChar"/>
+    <w:uiPriority w:val="99"/>
+    <w:unhideWhenUsed/>
+    <w:rsid w:val="00AA2EA2"/>
+    <w:pPr>
+      <w:tabs>
+        <w:tab w:val="center" w:pos="4680"/>
+        <w:tab w:val="right" w:pos="9360"/>
+      </w:tabs>
+      <w:spacing w:after="0" w:line="240" w:lineRule="auto"/>
+    </w:pPr>
+  </w:style>
+  <w:style w:type="character" w:customStyle="1" w:styleId="FooterChar">
+    <w:name w:val="Footer Char"/>
+    <w:basedOn w:val="DefaultParagraphFont"/>
+    <w:link w:val="Footer"/>
+    <w:uiPriority w:val="99"/>
+    <w:rsid w:val="00AA2EA2"/>
+  </w:style>
 </w:styles>
 </file>
 

</xml_diff>